<commit_message>
solve the three tasks (pert and gantt charts) and restructuring folders and files
</commit_message>
<xml_diff>
--- a/Project-Documentation.docx
+++ b/Project-Documentation.docx
@@ -6330,11 +6330,3683 @@
         </w:tc>
       </w:tr>
     </w:tbl>
-    <w:p/>
+    <w:p>
+      <w:pPr>
+        <w:sectPr>
+          <w:footerReference r:id="rId3" w:type="default"/>
+          <w:pgSz w:w="16838" w:h="11906" w:orient="landscape"/>
+          <w:pgMar w:top="760" w:right="1034" w:bottom="760" w:left="1034" w:header="708" w:footer="708" w:gutter="0"/>
+          <w:cols w:space="720" w:num="1"/>
+          <w:docGrid w:linePitch="360" w:charSpace="0"/>
+        </w:sectPr>
+      </w:pPr>
+    </w:p>
+    <w:p>
+      <w:pPr>
+        <w:pStyle w:val="2"/>
+      </w:pPr>
+      <w:r>
+        <w:t>Phase 3: Project Plan</w:t>
+      </w:r>
+    </w:p>
+    <w:p>
+      <w:pPr>
+        <w:pStyle w:val="3"/>
+      </w:pPr>
+      <w:r>
+        <w:t>Task 1</w:t>
+      </w:r>
+    </w:p>
+    <w:p>
+      <w:pPr>
+        <w:spacing w:after="120"/>
+      </w:pPr>
+      <w:r>
+        <w:rPr>
+          <w:rFonts w:ascii="Calibri" w:hAnsi="Calibri" w:eastAsia="Calibri" w:cs="Calibri"/>
+          <w:sz w:val="22"/>
+          <w:szCs w:val="22"/>
+        </w:rPr>
+        <w:t xml:space="preserve">Draw the </w:t>
+      </w:r>
+      <w:r>
+        <w:rPr>
+          <w:rFonts w:hint="default" w:cs="Calibri"/>
+          <w:sz w:val="22"/>
+          <w:szCs w:val="22"/>
+          <w:lang w:val="en-US"/>
+        </w:rPr>
+        <w:t xml:space="preserve">Pert chart </w:t>
+      </w:r>
+      <w:bookmarkStart w:id="0" w:name="_GoBack"/>
+      <w:bookmarkEnd w:id="0"/>
+      <w:r>
+        <w:rPr>
+          <w:rFonts w:ascii="Calibri" w:hAnsi="Calibri" w:eastAsia="Calibri" w:cs="Calibri"/>
+          <w:sz w:val="22"/>
+          <w:szCs w:val="22"/>
+        </w:rPr>
+        <w:t>for the following activities:</w:t>
+      </w:r>
+    </w:p>
+    <w:tbl>
+      <w:tblPr>
+        <w:tblStyle w:val="9"/>
+        <w:tblW w:w="5400" w:type="dxa"/>
+        <w:jc w:val="center"/>
+        <w:tblLayout w:type="fixed"/>
+        <w:tblCellMar>
+          <w:top w:w="0" w:type="dxa"/>
+          <w:left w:w="108" w:type="dxa"/>
+          <w:bottom w:w="0" w:type="dxa"/>
+          <w:right w:w="108" w:type="dxa"/>
+        </w:tblCellMar>
+      </w:tblPr>
+      <w:tblGrid>
+        <w:gridCol w:w="2400"/>
+        <w:gridCol w:w="3000"/>
+      </w:tblGrid>
+      <w:tr>
+        <w:trPr>
+          <w:cantSplit/>
+          <w:tblHeader/>
+          <w:jc w:val="center"/>
+        </w:trPr>
+        <w:tc>
+          <w:tcPr>
+            <w:tcW w:w="2400" w:type="dxa"/>
+            <w:tcBorders>
+              <w:top w:val="single" w:color="FFFFFF" w:sz="4" w:space="0"/>
+              <w:left w:val="single" w:color="FFFFFF" w:sz="4" w:space="0"/>
+              <w:bottom w:val="single" w:color="FFFFFF" w:sz="4" w:space="0"/>
+              <w:right w:val="single" w:color="FFFFFF" w:sz="4" w:space="0"/>
+            </w:tcBorders>
+            <w:shd w:val="clear" w:color="auto" w:fill="1F4E79"/>
+            <w:tcMar>
+              <w:top w:w="50" w:type="dxa"/>
+              <w:left w:w="80" w:type="dxa"/>
+              <w:bottom w:w="50" w:type="dxa"/>
+              <w:right w:w="80" w:type="dxa"/>
+            </w:tcMar>
+          </w:tcPr>
+          <w:p>
+            <w:pPr>
+              <w:jc w:val="center"/>
+            </w:pPr>
+            <w:r>
+              <w:rPr>
+                <w:rFonts w:ascii="Calibri" w:hAnsi="Calibri" w:eastAsia="Calibri" w:cs="Calibri"/>
+                <w:b/>
+                <w:bCs/>
+                <w:color w:val="FFFFFF"/>
+                <w:sz w:val="21"/>
+                <w:szCs w:val="21"/>
+              </w:rPr>
+              <w:t>Activity</w:t>
+            </w:r>
+          </w:p>
+        </w:tc>
+        <w:tc>
+          <w:tcPr>
+            <w:tcW w:w="3000" w:type="dxa"/>
+            <w:tcBorders>
+              <w:top w:val="single" w:color="FFFFFF" w:sz="4" w:space="0"/>
+              <w:left w:val="single" w:color="FFFFFF" w:sz="4" w:space="0"/>
+              <w:bottom w:val="single" w:color="FFFFFF" w:sz="4" w:space="0"/>
+              <w:right w:val="single" w:color="FFFFFF" w:sz="4" w:space="0"/>
+            </w:tcBorders>
+            <w:shd w:val="clear" w:color="auto" w:fill="1F4E79"/>
+            <w:tcMar>
+              <w:top w:w="50" w:type="dxa"/>
+              <w:left w:w="80" w:type="dxa"/>
+              <w:bottom w:w="50" w:type="dxa"/>
+              <w:right w:w="80" w:type="dxa"/>
+            </w:tcMar>
+          </w:tcPr>
+          <w:p>
+            <w:pPr>
+              <w:jc w:val="center"/>
+            </w:pPr>
+            <w:r>
+              <w:rPr>
+                <w:rFonts w:ascii="Calibri" w:hAnsi="Calibri" w:eastAsia="Calibri" w:cs="Calibri"/>
+                <w:b/>
+                <w:bCs/>
+                <w:color w:val="FFFFFF"/>
+                <w:sz w:val="21"/>
+                <w:szCs w:val="21"/>
+              </w:rPr>
+              <w:t>Predecessor</w:t>
+            </w:r>
+          </w:p>
+        </w:tc>
+      </w:tr>
+      <w:tr>
+        <w:tblPrEx>
+          <w:tblCellMar>
+            <w:top w:w="0" w:type="dxa"/>
+            <w:left w:w="108" w:type="dxa"/>
+            <w:bottom w:w="0" w:type="dxa"/>
+            <w:right w:w="108" w:type="dxa"/>
+          </w:tblCellMar>
+        </w:tblPrEx>
+        <w:trPr>
+          <w:cantSplit/>
+          <w:jc w:val="center"/>
+        </w:trPr>
+        <w:tc>
+          <w:tcPr>
+            <w:tcW w:w="2400" w:type="dxa"/>
+            <w:tcBorders>
+              <w:top w:val="single" w:color="FFFFFF" w:sz="4" w:space="0"/>
+              <w:left w:val="single" w:color="FFFFFF" w:sz="4" w:space="0"/>
+              <w:bottom w:val="single" w:color="FFFFFF" w:sz="4" w:space="0"/>
+              <w:right w:val="single" w:color="FFFFFF" w:sz="4" w:space="0"/>
+            </w:tcBorders>
+            <w:shd w:val="clear" w:color="auto" w:fill="CFE2F5"/>
+            <w:tcMar>
+              <w:top w:w="50" w:type="dxa"/>
+              <w:left w:w="80" w:type="dxa"/>
+              <w:bottom w:w="50" w:type="dxa"/>
+              <w:right w:w="80" w:type="dxa"/>
+            </w:tcMar>
+          </w:tcPr>
+          <w:p>
+            <w:pPr>
+              <w:jc w:val="center"/>
+            </w:pPr>
+            <w:r>
+              <w:rPr>
+                <w:rFonts w:ascii="Calibri" w:hAnsi="Calibri" w:eastAsia="Calibri" w:cs="Calibri"/>
+                <w:sz w:val="21"/>
+                <w:szCs w:val="21"/>
+              </w:rPr>
+              <w:t>A</w:t>
+            </w:r>
+          </w:p>
+        </w:tc>
+        <w:tc>
+          <w:tcPr>
+            <w:tcW w:w="3000" w:type="dxa"/>
+            <w:tcBorders>
+              <w:top w:val="single" w:color="FFFFFF" w:sz="4" w:space="0"/>
+              <w:left w:val="single" w:color="FFFFFF" w:sz="4" w:space="0"/>
+              <w:bottom w:val="single" w:color="FFFFFF" w:sz="4" w:space="0"/>
+              <w:right w:val="single" w:color="FFFFFF" w:sz="4" w:space="0"/>
+            </w:tcBorders>
+            <w:shd w:val="clear" w:color="auto" w:fill="CFE2F5"/>
+            <w:tcMar>
+              <w:top w:w="50" w:type="dxa"/>
+              <w:left w:w="80" w:type="dxa"/>
+              <w:bottom w:w="50" w:type="dxa"/>
+              <w:right w:w="80" w:type="dxa"/>
+            </w:tcMar>
+          </w:tcPr>
+          <w:p>
+            <w:pPr>
+              <w:jc w:val="center"/>
+            </w:pPr>
+            <w:r>
+              <w:rPr>
+                <w:rFonts w:ascii="Calibri" w:hAnsi="Calibri" w:eastAsia="Calibri" w:cs="Calibri"/>
+                <w:sz w:val="21"/>
+                <w:szCs w:val="21"/>
+              </w:rPr>
+              <w:t>-</w:t>
+            </w:r>
+          </w:p>
+        </w:tc>
+      </w:tr>
+      <w:tr>
+        <w:tblPrEx>
+          <w:tblCellMar>
+            <w:top w:w="0" w:type="dxa"/>
+            <w:left w:w="108" w:type="dxa"/>
+            <w:bottom w:w="0" w:type="dxa"/>
+            <w:right w:w="108" w:type="dxa"/>
+          </w:tblCellMar>
+        </w:tblPrEx>
+        <w:trPr>
+          <w:cantSplit/>
+          <w:jc w:val="center"/>
+        </w:trPr>
+        <w:tc>
+          <w:tcPr>
+            <w:tcW w:w="2400" w:type="dxa"/>
+            <w:tcBorders>
+              <w:top w:val="single" w:color="FFFFFF" w:sz="4" w:space="0"/>
+              <w:left w:val="single" w:color="FFFFFF" w:sz="4" w:space="0"/>
+              <w:bottom w:val="single" w:color="FFFFFF" w:sz="4" w:space="0"/>
+              <w:right w:val="single" w:color="FFFFFF" w:sz="4" w:space="0"/>
+            </w:tcBorders>
+            <w:shd w:val="clear" w:color="auto" w:fill="EAF2FB"/>
+            <w:tcMar>
+              <w:top w:w="50" w:type="dxa"/>
+              <w:left w:w="80" w:type="dxa"/>
+              <w:bottom w:w="50" w:type="dxa"/>
+              <w:right w:w="80" w:type="dxa"/>
+            </w:tcMar>
+          </w:tcPr>
+          <w:p>
+            <w:pPr>
+              <w:jc w:val="center"/>
+            </w:pPr>
+            <w:r>
+              <w:rPr>
+                <w:rFonts w:ascii="Calibri" w:hAnsi="Calibri" w:eastAsia="Calibri" w:cs="Calibri"/>
+                <w:sz w:val="21"/>
+                <w:szCs w:val="21"/>
+              </w:rPr>
+              <w:t>B</w:t>
+            </w:r>
+          </w:p>
+        </w:tc>
+        <w:tc>
+          <w:tcPr>
+            <w:tcW w:w="3000" w:type="dxa"/>
+            <w:tcBorders>
+              <w:top w:val="single" w:color="FFFFFF" w:sz="4" w:space="0"/>
+              <w:left w:val="single" w:color="FFFFFF" w:sz="4" w:space="0"/>
+              <w:bottom w:val="single" w:color="FFFFFF" w:sz="4" w:space="0"/>
+              <w:right w:val="single" w:color="FFFFFF" w:sz="4" w:space="0"/>
+            </w:tcBorders>
+            <w:shd w:val="clear" w:color="auto" w:fill="EAF2FB"/>
+            <w:tcMar>
+              <w:top w:w="50" w:type="dxa"/>
+              <w:left w:w="80" w:type="dxa"/>
+              <w:bottom w:w="50" w:type="dxa"/>
+              <w:right w:w="80" w:type="dxa"/>
+            </w:tcMar>
+          </w:tcPr>
+          <w:p>
+            <w:pPr>
+              <w:jc w:val="center"/>
+            </w:pPr>
+            <w:r>
+              <w:rPr>
+                <w:rFonts w:ascii="Calibri" w:hAnsi="Calibri" w:eastAsia="Calibri" w:cs="Calibri"/>
+                <w:sz w:val="21"/>
+                <w:szCs w:val="21"/>
+              </w:rPr>
+              <w:t>A</w:t>
+            </w:r>
+          </w:p>
+        </w:tc>
+      </w:tr>
+      <w:tr>
+        <w:tblPrEx>
+          <w:tblCellMar>
+            <w:top w:w="0" w:type="dxa"/>
+            <w:left w:w="108" w:type="dxa"/>
+            <w:bottom w:w="0" w:type="dxa"/>
+            <w:right w:w="108" w:type="dxa"/>
+          </w:tblCellMar>
+        </w:tblPrEx>
+        <w:trPr>
+          <w:cantSplit/>
+          <w:jc w:val="center"/>
+        </w:trPr>
+        <w:tc>
+          <w:tcPr>
+            <w:tcW w:w="2400" w:type="dxa"/>
+            <w:tcBorders>
+              <w:top w:val="single" w:color="FFFFFF" w:sz="4" w:space="0"/>
+              <w:left w:val="single" w:color="FFFFFF" w:sz="4" w:space="0"/>
+              <w:bottom w:val="single" w:color="FFFFFF" w:sz="4" w:space="0"/>
+              <w:right w:val="single" w:color="FFFFFF" w:sz="4" w:space="0"/>
+            </w:tcBorders>
+            <w:shd w:val="clear" w:color="auto" w:fill="CFE2F5"/>
+            <w:tcMar>
+              <w:top w:w="50" w:type="dxa"/>
+              <w:left w:w="80" w:type="dxa"/>
+              <w:bottom w:w="50" w:type="dxa"/>
+              <w:right w:w="80" w:type="dxa"/>
+            </w:tcMar>
+          </w:tcPr>
+          <w:p>
+            <w:pPr>
+              <w:jc w:val="center"/>
+            </w:pPr>
+            <w:r>
+              <w:rPr>
+                <w:rFonts w:ascii="Calibri" w:hAnsi="Calibri" w:eastAsia="Calibri" w:cs="Calibri"/>
+                <w:sz w:val="21"/>
+                <w:szCs w:val="21"/>
+              </w:rPr>
+              <w:t>C</w:t>
+            </w:r>
+          </w:p>
+        </w:tc>
+        <w:tc>
+          <w:tcPr>
+            <w:tcW w:w="3000" w:type="dxa"/>
+            <w:tcBorders>
+              <w:top w:val="single" w:color="FFFFFF" w:sz="4" w:space="0"/>
+              <w:left w:val="single" w:color="FFFFFF" w:sz="4" w:space="0"/>
+              <w:bottom w:val="single" w:color="FFFFFF" w:sz="4" w:space="0"/>
+              <w:right w:val="single" w:color="FFFFFF" w:sz="4" w:space="0"/>
+            </w:tcBorders>
+            <w:shd w:val="clear" w:color="auto" w:fill="CFE2F5"/>
+            <w:tcMar>
+              <w:top w:w="50" w:type="dxa"/>
+              <w:left w:w="80" w:type="dxa"/>
+              <w:bottom w:w="50" w:type="dxa"/>
+              <w:right w:w="80" w:type="dxa"/>
+            </w:tcMar>
+          </w:tcPr>
+          <w:p>
+            <w:pPr>
+              <w:jc w:val="center"/>
+            </w:pPr>
+            <w:r>
+              <w:rPr>
+                <w:rFonts w:ascii="Calibri" w:hAnsi="Calibri" w:eastAsia="Calibri" w:cs="Calibri"/>
+                <w:sz w:val="21"/>
+                <w:szCs w:val="21"/>
+              </w:rPr>
+              <w:t>A</w:t>
+            </w:r>
+          </w:p>
+        </w:tc>
+      </w:tr>
+      <w:tr>
+        <w:tblPrEx>
+          <w:tblCellMar>
+            <w:top w:w="0" w:type="dxa"/>
+            <w:left w:w="108" w:type="dxa"/>
+            <w:bottom w:w="0" w:type="dxa"/>
+            <w:right w:w="108" w:type="dxa"/>
+          </w:tblCellMar>
+        </w:tblPrEx>
+        <w:trPr>
+          <w:cantSplit/>
+          <w:jc w:val="center"/>
+        </w:trPr>
+        <w:tc>
+          <w:tcPr>
+            <w:tcW w:w="2400" w:type="dxa"/>
+            <w:tcBorders>
+              <w:top w:val="single" w:color="FFFFFF" w:sz="4" w:space="0"/>
+              <w:left w:val="single" w:color="FFFFFF" w:sz="4" w:space="0"/>
+              <w:bottom w:val="single" w:color="FFFFFF" w:sz="4" w:space="0"/>
+              <w:right w:val="single" w:color="FFFFFF" w:sz="4" w:space="0"/>
+            </w:tcBorders>
+            <w:shd w:val="clear" w:color="auto" w:fill="EAF2FB"/>
+            <w:tcMar>
+              <w:top w:w="50" w:type="dxa"/>
+              <w:left w:w="80" w:type="dxa"/>
+              <w:bottom w:w="50" w:type="dxa"/>
+              <w:right w:w="80" w:type="dxa"/>
+            </w:tcMar>
+          </w:tcPr>
+          <w:p>
+            <w:pPr>
+              <w:jc w:val="center"/>
+            </w:pPr>
+            <w:r>
+              <w:rPr>
+                <w:rFonts w:ascii="Calibri" w:hAnsi="Calibri" w:eastAsia="Calibri" w:cs="Calibri"/>
+                <w:sz w:val="21"/>
+                <w:szCs w:val="21"/>
+              </w:rPr>
+              <w:t>D</w:t>
+            </w:r>
+          </w:p>
+        </w:tc>
+        <w:tc>
+          <w:tcPr>
+            <w:tcW w:w="3000" w:type="dxa"/>
+            <w:tcBorders>
+              <w:top w:val="single" w:color="FFFFFF" w:sz="4" w:space="0"/>
+              <w:left w:val="single" w:color="FFFFFF" w:sz="4" w:space="0"/>
+              <w:bottom w:val="single" w:color="FFFFFF" w:sz="4" w:space="0"/>
+              <w:right w:val="single" w:color="FFFFFF" w:sz="4" w:space="0"/>
+            </w:tcBorders>
+            <w:shd w:val="clear" w:color="auto" w:fill="EAF2FB"/>
+            <w:tcMar>
+              <w:top w:w="50" w:type="dxa"/>
+              <w:left w:w="80" w:type="dxa"/>
+              <w:bottom w:w="50" w:type="dxa"/>
+              <w:right w:w="80" w:type="dxa"/>
+            </w:tcMar>
+          </w:tcPr>
+          <w:p>
+            <w:pPr>
+              <w:jc w:val="center"/>
+            </w:pPr>
+            <w:r>
+              <w:rPr>
+                <w:rFonts w:ascii="Calibri" w:hAnsi="Calibri" w:eastAsia="Calibri" w:cs="Calibri"/>
+                <w:sz w:val="21"/>
+                <w:szCs w:val="21"/>
+              </w:rPr>
+              <w:t>-</w:t>
+            </w:r>
+          </w:p>
+        </w:tc>
+      </w:tr>
+      <w:tr>
+        <w:tblPrEx>
+          <w:tblCellMar>
+            <w:top w:w="0" w:type="dxa"/>
+            <w:left w:w="108" w:type="dxa"/>
+            <w:bottom w:w="0" w:type="dxa"/>
+            <w:right w:w="108" w:type="dxa"/>
+          </w:tblCellMar>
+        </w:tblPrEx>
+        <w:trPr>
+          <w:cantSplit/>
+          <w:jc w:val="center"/>
+        </w:trPr>
+        <w:tc>
+          <w:tcPr>
+            <w:tcW w:w="2400" w:type="dxa"/>
+            <w:tcBorders>
+              <w:top w:val="single" w:color="FFFFFF" w:sz="4" w:space="0"/>
+              <w:left w:val="single" w:color="FFFFFF" w:sz="4" w:space="0"/>
+              <w:bottom w:val="single" w:color="FFFFFF" w:sz="4" w:space="0"/>
+              <w:right w:val="single" w:color="FFFFFF" w:sz="4" w:space="0"/>
+            </w:tcBorders>
+            <w:shd w:val="clear" w:color="auto" w:fill="CFE2F5"/>
+            <w:tcMar>
+              <w:top w:w="50" w:type="dxa"/>
+              <w:left w:w="80" w:type="dxa"/>
+              <w:bottom w:w="50" w:type="dxa"/>
+              <w:right w:w="80" w:type="dxa"/>
+            </w:tcMar>
+          </w:tcPr>
+          <w:p>
+            <w:pPr>
+              <w:jc w:val="center"/>
+            </w:pPr>
+            <w:r>
+              <w:rPr>
+                <w:rFonts w:ascii="Calibri" w:hAnsi="Calibri" w:eastAsia="Calibri" w:cs="Calibri"/>
+                <w:sz w:val="21"/>
+                <w:szCs w:val="21"/>
+              </w:rPr>
+              <w:t>E</w:t>
+            </w:r>
+          </w:p>
+        </w:tc>
+        <w:tc>
+          <w:tcPr>
+            <w:tcW w:w="3000" w:type="dxa"/>
+            <w:tcBorders>
+              <w:top w:val="single" w:color="FFFFFF" w:sz="4" w:space="0"/>
+              <w:left w:val="single" w:color="FFFFFF" w:sz="4" w:space="0"/>
+              <w:bottom w:val="single" w:color="FFFFFF" w:sz="4" w:space="0"/>
+              <w:right w:val="single" w:color="FFFFFF" w:sz="4" w:space="0"/>
+            </w:tcBorders>
+            <w:shd w:val="clear" w:color="auto" w:fill="CFE2F5"/>
+            <w:tcMar>
+              <w:top w:w="50" w:type="dxa"/>
+              <w:left w:w="80" w:type="dxa"/>
+              <w:bottom w:w="50" w:type="dxa"/>
+              <w:right w:w="80" w:type="dxa"/>
+            </w:tcMar>
+          </w:tcPr>
+          <w:p>
+            <w:pPr>
+              <w:jc w:val="center"/>
+            </w:pPr>
+            <w:r>
+              <w:rPr>
+                <w:rFonts w:ascii="Calibri" w:hAnsi="Calibri" w:eastAsia="Calibri" w:cs="Calibri"/>
+                <w:sz w:val="21"/>
+                <w:szCs w:val="21"/>
+              </w:rPr>
+              <w:t>D</w:t>
+            </w:r>
+          </w:p>
+        </w:tc>
+      </w:tr>
+      <w:tr>
+        <w:tblPrEx>
+          <w:tblCellMar>
+            <w:top w:w="0" w:type="dxa"/>
+            <w:left w:w="108" w:type="dxa"/>
+            <w:bottom w:w="0" w:type="dxa"/>
+            <w:right w:w="108" w:type="dxa"/>
+          </w:tblCellMar>
+        </w:tblPrEx>
+        <w:trPr>
+          <w:cantSplit/>
+          <w:jc w:val="center"/>
+        </w:trPr>
+        <w:tc>
+          <w:tcPr>
+            <w:tcW w:w="2400" w:type="dxa"/>
+            <w:tcBorders>
+              <w:top w:val="single" w:color="FFFFFF" w:sz="4" w:space="0"/>
+              <w:left w:val="single" w:color="FFFFFF" w:sz="4" w:space="0"/>
+              <w:bottom w:val="single" w:color="FFFFFF" w:sz="4" w:space="0"/>
+              <w:right w:val="single" w:color="FFFFFF" w:sz="4" w:space="0"/>
+            </w:tcBorders>
+            <w:shd w:val="clear" w:color="auto" w:fill="EAF2FB"/>
+            <w:tcMar>
+              <w:top w:w="50" w:type="dxa"/>
+              <w:left w:w="80" w:type="dxa"/>
+              <w:bottom w:w="50" w:type="dxa"/>
+              <w:right w:w="80" w:type="dxa"/>
+            </w:tcMar>
+          </w:tcPr>
+          <w:p>
+            <w:pPr>
+              <w:jc w:val="center"/>
+            </w:pPr>
+            <w:r>
+              <w:rPr>
+                <w:rFonts w:ascii="Calibri" w:hAnsi="Calibri" w:eastAsia="Calibri" w:cs="Calibri"/>
+                <w:sz w:val="21"/>
+                <w:szCs w:val="21"/>
+              </w:rPr>
+              <w:t>F</w:t>
+            </w:r>
+          </w:p>
+        </w:tc>
+        <w:tc>
+          <w:tcPr>
+            <w:tcW w:w="3000" w:type="dxa"/>
+            <w:tcBorders>
+              <w:top w:val="single" w:color="FFFFFF" w:sz="4" w:space="0"/>
+              <w:left w:val="single" w:color="FFFFFF" w:sz="4" w:space="0"/>
+              <w:bottom w:val="single" w:color="FFFFFF" w:sz="4" w:space="0"/>
+              <w:right w:val="single" w:color="FFFFFF" w:sz="4" w:space="0"/>
+            </w:tcBorders>
+            <w:shd w:val="clear" w:color="auto" w:fill="EAF2FB"/>
+            <w:tcMar>
+              <w:top w:w="50" w:type="dxa"/>
+              <w:left w:w="80" w:type="dxa"/>
+              <w:bottom w:w="50" w:type="dxa"/>
+              <w:right w:w="80" w:type="dxa"/>
+            </w:tcMar>
+          </w:tcPr>
+          <w:p>
+            <w:pPr>
+              <w:jc w:val="center"/>
+            </w:pPr>
+            <w:r>
+              <w:rPr>
+                <w:rFonts w:ascii="Calibri" w:hAnsi="Calibri" w:eastAsia="Calibri" w:cs="Calibri"/>
+                <w:sz w:val="21"/>
+                <w:szCs w:val="21"/>
+              </w:rPr>
+              <w:t>B, C, E</w:t>
+            </w:r>
+          </w:p>
+        </w:tc>
+      </w:tr>
+      <w:tr>
+        <w:tblPrEx>
+          <w:tblCellMar>
+            <w:top w:w="0" w:type="dxa"/>
+            <w:left w:w="108" w:type="dxa"/>
+            <w:bottom w:w="0" w:type="dxa"/>
+            <w:right w:w="108" w:type="dxa"/>
+          </w:tblCellMar>
+        </w:tblPrEx>
+        <w:trPr>
+          <w:cantSplit/>
+          <w:jc w:val="center"/>
+        </w:trPr>
+        <w:tc>
+          <w:tcPr>
+            <w:tcW w:w="2400" w:type="dxa"/>
+            <w:tcBorders>
+              <w:top w:val="single" w:color="FFFFFF" w:sz="4" w:space="0"/>
+              <w:left w:val="single" w:color="FFFFFF" w:sz="4" w:space="0"/>
+              <w:bottom w:val="single" w:color="FFFFFF" w:sz="4" w:space="0"/>
+              <w:right w:val="single" w:color="FFFFFF" w:sz="4" w:space="0"/>
+            </w:tcBorders>
+            <w:shd w:val="clear" w:color="auto" w:fill="CFE2F5"/>
+            <w:tcMar>
+              <w:top w:w="50" w:type="dxa"/>
+              <w:left w:w="80" w:type="dxa"/>
+              <w:bottom w:w="50" w:type="dxa"/>
+              <w:right w:w="80" w:type="dxa"/>
+            </w:tcMar>
+          </w:tcPr>
+          <w:p>
+            <w:pPr>
+              <w:jc w:val="center"/>
+            </w:pPr>
+            <w:r>
+              <w:rPr>
+                <w:rFonts w:ascii="Calibri" w:hAnsi="Calibri" w:eastAsia="Calibri" w:cs="Calibri"/>
+                <w:sz w:val="21"/>
+                <w:szCs w:val="21"/>
+              </w:rPr>
+              <w:t>G</w:t>
+            </w:r>
+          </w:p>
+        </w:tc>
+        <w:tc>
+          <w:tcPr>
+            <w:tcW w:w="3000" w:type="dxa"/>
+            <w:tcBorders>
+              <w:top w:val="single" w:color="FFFFFF" w:sz="4" w:space="0"/>
+              <w:left w:val="single" w:color="FFFFFF" w:sz="4" w:space="0"/>
+              <w:bottom w:val="single" w:color="FFFFFF" w:sz="4" w:space="0"/>
+              <w:right w:val="single" w:color="FFFFFF" w:sz="4" w:space="0"/>
+            </w:tcBorders>
+            <w:shd w:val="clear" w:color="auto" w:fill="CFE2F5"/>
+            <w:tcMar>
+              <w:top w:w="50" w:type="dxa"/>
+              <w:left w:w="80" w:type="dxa"/>
+              <w:bottom w:w="50" w:type="dxa"/>
+              <w:right w:w="80" w:type="dxa"/>
+            </w:tcMar>
+          </w:tcPr>
+          <w:p>
+            <w:pPr>
+              <w:jc w:val="center"/>
+            </w:pPr>
+            <w:r>
+              <w:rPr>
+                <w:rFonts w:ascii="Calibri" w:hAnsi="Calibri" w:eastAsia="Calibri" w:cs="Calibri"/>
+                <w:sz w:val="21"/>
+                <w:szCs w:val="21"/>
+              </w:rPr>
+              <w:t>F</w:t>
+            </w:r>
+          </w:p>
+        </w:tc>
+      </w:tr>
+      <w:tr>
+        <w:tblPrEx>
+          <w:tblCellMar>
+            <w:top w:w="0" w:type="dxa"/>
+            <w:left w:w="108" w:type="dxa"/>
+            <w:bottom w:w="0" w:type="dxa"/>
+            <w:right w:w="108" w:type="dxa"/>
+          </w:tblCellMar>
+        </w:tblPrEx>
+        <w:trPr>
+          <w:cantSplit/>
+          <w:jc w:val="center"/>
+        </w:trPr>
+        <w:tc>
+          <w:tcPr>
+            <w:tcW w:w="2400" w:type="dxa"/>
+            <w:tcBorders>
+              <w:top w:val="single" w:color="FFFFFF" w:sz="4" w:space="0"/>
+              <w:left w:val="single" w:color="FFFFFF" w:sz="4" w:space="0"/>
+              <w:bottom w:val="single" w:color="FFFFFF" w:sz="4" w:space="0"/>
+              <w:right w:val="single" w:color="FFFFFF" w:sz="4" w:space="0"/>
+            </w:tcBorders>
+            <w:shd w:val="clear" w:color="auto" w:fill="EAF2FB"/>
+            <w:tcMar>
+              <w:top w:w="50" w:type="dxa"/>
+              <w:left w:w="80" w:type="dxa"/>
+              <w:bottom w:w="50" w:type="dxa"/>
+              <w:right w:w="80" w:type="dxa"/>
+            </w:tcMar>
+          </w:tcPr>
+          <w:p>
+            <w:pPr>
+              <w:jc w:val="center"/>
+            </w:pPr>
+            <w:r>
+              <w:rPr>
+                <w:rFonts w:ascii="Calibri" w:hAnsi="Calibri" w:eastAsia="Calibri" w:cs="Calibri"/>
+                <w:sz w:val="21"/>
+                <w:szCs w:val="21"/>
+              </w:rPr>
+              <w:t>H</w:t>
+            </w:r>
+          </w:p>
+        </w:tc>
+        <w:tc>
+          <w:tcPr>
+            <w:tcW w:w="3000" w:type="dxa"/>
+            <w:tcBorders>
+              <w:top w:val="single" w:color="FFFFFF" w:sz="4" w:space="0"/>
+              <w:left w:val="single" w:color="FFFFFF" w:sz="4" w:space="0"/>
+              <w:bottom w:val="single" w:color="FFFFFF" w:sz="4" w:space="0"/>
+              <w:right w:val="single" w:color="FFFFFF" w:sz="4" w:space="0"/>
+            </w:tcBorders>
+            <w:shd w:val="clear" w:color="auto" w:fill="EAF2FB"/>
+            <w:tcMar>
+              <w:top w:w="50" w:type="dxa"/>
+              <w:left w:w="80" w:type="dxa"/>
+              <w:bottom w:w="50" w:type="dxa"/>
+              <w:right w:w="80" w:type="dxa"/>
+            </w:tcMar>
+          </w:tcPr>
+          <w:p>
+            <w:pPr>
+              <w:jc w:val="center"/>
+            </w:pPr>
+            <w:r>
+              <w:rPr>
+                <w:rFonts w:ascii="Calibri" w:hAnsi="Calibri" w:eastAsia="Calibri" w:cs="Calibri"/>
+                <w:sz w:val="21"/>
+                <w:szCs w:val="21"/>
+              </w:rPr>
+              <w:t>D</w:t>
+            </w:r>
+          </w:p>
+        </w:tc>
+      </w:tr>
+      <w:tr>
+        <w:tblPrEx>
+          <w:tblCellMar>
+            <w:top w:w="0" w:type="dxa"/>
+            <w:left w:w="108" w:type="dxa"/>
+            <w:bottom w:w="0" w:type="dxa"/>
+            <w:right w:w="108" w:type="dxa"/>
+          </w:tblCellMar>
+        </w:tblPrEx>
+        <w:trPr>
+          <w:cantSplit/>
+          <w:jc w:val="center"/>
+        </w:trPr>
+        <w:tc>
+          <w:tcPr>
+            <w:tcW w:w="2400" w:type="dxa"/>
+            <w:tcBorders>
+              <w:top w:val="single" w:color="FFFFFF" w:sz="4" w:space="0"/>
+              <w:left w:val="single" w:color="FFFFFF" w:sz="4" w:space="0"/>
+              <w:bottom w:val="single" w:color="FFFFFF" w:sz="4" w:space="0"/>
+              <w:right w:val="single" w:color="FFFFFF" w:sz="4" w:space="0"/>
+            </w:tcBorders>
+            <w:shd w:val="clear" w:color="auto" w:fill="CFE2F5"/>
+            <w:tcMar>
+              <w:top w:w="50" w:type="dxa"/>
+              <w:left w:w="80" w:type="dxa"/>
+              <w:bottom w:w="50" w:type="dxa"/>
+              <w:right w:w="80" w:type="dxa"/>
+            </w:tcMar>
+          </w:tcPr>
+          <w:p>
+            <w:pPr>
+              <w:jc w:val="center"/>
+            </w:pPr>
+            <w:r>
+              <w:rPr>
+                <w:rFonts w:ascii="Calibri" w:hAnsi="Calibri" w:eastAsia="Calibri" w:cs="Calibri"/>
+                <w:sz w:val="21"/>
+                <w:szCs w:val="21"/>
+              </w:rPr>
+              <w:t>I</w:t>
+            </w:r>
+          </w:p>
+        </w:tc>
+        <w:tc>
+          <w:tcPr>
+            <w:tcW w:w="3000" w:type="dxa"/>
+            <w:tcBorders>
+              <w:top w:val="single" w:color="FFFFFF" w:sz="4" w:space="0"/>
+              <w:left w:val="single" w:color="FFFFFF" w:sz="4" w:space="0"/>
+              <w:bottom w:val="single" w:color="FFFFFF" w:sz="4" w:space="0"/>
+              <w:right w:val="single" w:color="FFFFFF" w:sz="4" w:space="0"/>
+            </w:tcBorders>
+            <w:shd w:val="clear" w:color="auto" w:fill="CFE2F5"/>
+            <w:tcMar>
+              <w:top w:w="50" w:type="dxa"/>
+              <w:left w:w="80" w:type="dxa"/>
+              <w:bottom w:w="50" w:type="dxa"/>
+              <w:right w:w="80" w:type="dxa"/>
+            </w:tcMar>
+          </w:tcPr>
+          <w:p>
+            <w:pPr>
+              <w:jc w:val="center"/>
+            </w:pPr>
+            <w:r>
+              <w:rPr>
+                <w:rFonts w:ascii="Calibri" w:hAnsi="Calibri" w:eastAsia="Calibri" w:cs="Calibri"/>
+                <w:sz w:val="21"/>
+                <w:szCs w:val="21"/>
+              </w:rPr>
+              <w:t>G, H</w:t>
+            </w:r>
+          </w:p>
+        </w:tc>
+      </w:tr>
+    </w:tbl>
+    <w:p>
+      <w:pPr>
+        <w:keepNext/>
+        <w:spacing w:before="200" w:after="100"/>
+      </w:pPr>
+      <w:r>
+        <w:rPr>
+          <w:rFonts w:ascii="Calibri" w:hAnsi="Calibri" w:eastAsia="Calibri" w:cs="Calibri"/>
+          <w:b/>
+          <w:bCs/>
+          <w:color w:val="1F4E79"/>
+          <w:sz w:val="26"/>
+          <w:szCs w:val="26"/>
+        </w:rPr>
+        <w:t>Answer</w:t>
+      </w:r>
+    </w:p>
+    <w:p>
+      <w:pPr>
+        <w:spacing w:before="120" w:after="120"/>
+        <w:jc w:val="center"/>
+      </w:pPr>
+      <w:r>
+        <w:drawing>
+          <wp:inline distT="0" distB="0" distL="0" distR="0">
+            <wp:extent cx="5852160" cy="2623820"/>
+            <wp:effectExtent l="0" t="0" r="15240" b="5080"/>
+            <wp:docPr id="901" name="pert_fig1.png" descr="pert_fig1.png"/>
+            <wp:cNvGraphicFramePr>
+              <a:graphicFrameLocks xmlns:a="http://schemas.openxmlformats.org/drawingml/2006/main" noChangeAspect="1"/>
+            </wp:cNvGraphicFramePr>
+            <a:graphic xmlns:a="http://schemas.openxmlformats.org/drawingml/2006/main">
+              <a:graphicData uri="http://schemas.openxmlformats.org/drawingml/2006/picture">
+                <pic:pic xmlns:pic="http://schemas.openxmlformats.org/drawingml/2006/picture">
+                  <pic:nvPicPr>
+                    <pic:cNvPr id="901" name="pert_fig1.png" descr="pert_fig1.png"/>
+                    <pic:cNvPicPr>
+                      <a:picLocks noChangeAspect="1"/>
+                    </pic:cNvPicPr>
+                  </pic:nvPicPr>
+                  <pic:blipFill>
+                    <a:blip r:embed="rId6"/>
+                    <a:stretch>
+                      <a:fillRect/>
+                    </a:stretch>
+                  </pic:blipFill>
+                  <pic:spPr>
+                    <a:xfrm>
+                      <a:off x="0" y="0"/>
+                      <a:ext cx="5852160" cy="2624340"/>
+                    </a:xfrm>
+                    <a:prstGeom prst="rect">
+                      <a:avLst/>
+                    </a:prstGeom>
+                  </pic:spPr>
+                </pic:pic>
+              </a:graphicData>
+            </a:graphic>
+          </wp:inline>
+        </w:drawing>
+      </w:r>
+    </w:p>
+    <w:p>
+      <w:pPr>
+        <w:pStyle w:val="3"/>
+        <w:pageBreakBefore/>
+      </w:pPr>
+      <w:r>
+        <w:t>Task 2</w:t>
+      </w:r>
+    </w:p>
+    <w:p>
+      <w:pPr>
+        <w:spacing w:after="120"/>
+      </w:pPr>
+      <w:r>
+        <w:rPr>
+          <w:rFonts w:ascii="Calibri" w:hAnsi="Calibri" w:eastAsia="Calibri" w:cs="Calibri"/>
+          <w:sz w:val="22"/>
+          <w:szCs w:val="22"/>
+        </w:rPr>
+        <w:t>Draw the P</w:t>
+      </w:r>
+      <w:r>
+        <w:rPr>
+          <w:rFonts w:hint="default" w:cs="Calibri"/>
+          <w:sz w:val="22"/>
+          <w:szCs w:val="22"/>
+          <w:lang w:val="en-US"/>
+        </w:rPr>
+        <w:t>ert</w:t>
+      </w:r>
+      <w:r>
+        <w:rPr>
+          <w:rFonts w:ascii="Calibri" w:hAnsi="Calibri" w:eastAsia="Calibri" w:cs="Calibri"/>
+          <w:sz w:val="22"/>
+          <w:szCs w:val="22"/>
+        </w:rPr>
+        <w:t xml:space="preserve"> </w:t>
+      </w:r>
+      <w:r>
+        <w:rPr>
+          <w:rFonts w:hint="default" w:cs="Calibri"/>
+          <w:sz w:val="22"/>
+          <w:szCs w:val="22"/>
+          <w:lang w:val="en-US"/>
+        </w:rPr>
+        <w:t xml:space="preserve">chart </w:t>
+      </w:r>
+      <w:r>
+        <w:rPr>
+          <w:rFonts w:ascii="Calibri" w:hAnsi="Calibri" w:eastAsia="Calibri" w:cs="Calibri"/>
+          <w:sz w:val="22"/>
+          <w:szCs w:val="22"/>
+        </w:rPr>
+        <w:t>for the following activities:</w:t>
+      </w:r>
+    </w:p>
+    <w:tbl>
+      <w:tblPr>
+        <w:tblStyle w:val="9"/>
+        <w:tblW w:w="5400" w:type="dxa"/>
+        <w:jc w:val="center"/>
+        <w:tblLayout w:type="fixed"/>
+        <w:tblCellMar>
+          <w:top w:w="0" w:type="dxa"/>
+          <w:left w:w="108" w:type="dxa"/>
+          <w:bottom w:w="0" w:type="dxa"/>
+          <w:right w:w="108" w:type="dxa"/>
+        </w:tblCellMar>
+      </w:tblPr>
+      <w:tblGrid>
+        <w:gridCol w:w="2400"/>
+        <w:gridCol w:w="3000"/>
+      </w:tblGrid>
+      <w:tr>
+        <w:tblPrEx>
+          <w:tblCellMar>
+            <w:top w:w="0" w:type="dxa"/>
+            <w:left w:w="108" w:type="dxa"/>
+            <w:bottom w:w="0" w:type="dxa"/>
+            <w:right w:w="108" w:type="dxa"/>
+          </w:tblCellMar>
+        </w:tblPrEx>
+        <w:trPr>
+          <w:cantSplit/>
+          <w:tblHeader/>
+          <w:jc w:val="center"/>
+        </w:trPr>
+        <w:tc>
+          <w:tcPr>
+            <w:tcW w:w="2400" w:type="dxa"/>
+            <w:tcBorders>
+              <w:top w:val="single" w:color="FFFFFF" w:sz="4" w:space="0"/>
+              <w:left w:val="single" w:color="FFFFFF" w:sz="4" w:space="0"/>
+              <w:bottom w:val="single" w:color="FFFFFF" w:sz="4" w:space="0"/>
+              <w:right w:val="single" w:color="FFFFFF" w:sz="4" w:space="0"/>
+            </w:tcBorders>
+            <w:shd w:val="clear" w:color="auto" w:fill="1F4E79"/>
+            <w:tcMar>
+              <w:top w:w="50" w:type="dxa"/>
+              <w:left w:w="80" w:type="dxa"/>
+              <w:bottom w:w="50" w:type="dxa"/>
+              <w:right w:w="80" w:type="dxa"/>
+            </w:tcMar>
+          </w:tcPr>
+          <w:p>
+            <w:pPr>
+              <w:jc w:val="center"/>
+            </w:pPr>
+            <w:r>
+              <w:rPr>
+                <w:rFonts w:ascii="Calibri" w:hAnsi="Calibri" w:eastAsia="Calibri" w:cs="Calibri"/>
+                <w:b/>
+                <w:bCs/>
+                <w:color w:val="FFFFFF"/>
+                <w:sz w:val="21"/>
+                <w:szCs w:val="21"/>
+              </w:rPr>
+              <w:t>Activity</w:t>
+            </w:r>
+          </w:p>
+        </w:tc>
+        <w:tc>
+          <w:tcPr>
+            <w:tcW w:w="3000" w:type="dxa"/>
+            <w:tcBorders>
+              <w:top w:val="single" w:color="FFFFFF" w:sz="4" w:space="0"/>
+              <w:left w:val="single" w:color="FFFFFF" w:sz="4" w:space="0"/>
+              <w:bottom w:val="single" w:color="FFFFFF" w:sz="4" w:space="0"/>
+              <w:right w:val="single" w:color="FFFFFF" w:sz="4" w:space="0"/>
+            </w:tcBorders>
+            <w:shd w:val="clear" w:color="auto" w:fill="1F4E79"/>
+            <w:tcMar>
+              <w:top w:w="50" w:type="dxa"/>
+              <w:left w:w="80" w:type="dxa"/>
+              <w:bottom w:w="50" w:type="dxa"/>
+              <w:right w:w="80" w:type="dxa"/>
+            </w:tcMar>
+          </w:tcPr>
+          <w:p>
+            <w:pPr>
+              <w:jc w:val="center"/>
+            </w:pPr>
+            <w:r>
+              <w:rPr>
+                <w:rFonts w:ascii="Calibri" w:hAnsi="Calibri" w:eastAsia="Calibri" w:cs="Calibri"/>
+                <w:b/>
+                <w:bCs/>
+                <w:color w:val="FFFFFF"/>
+                <w:sz w:val="21"/>
+                <w:szCs w:val="21"/>
+              </w:rPr>
+              <w:t>Predecessor</w:t>
+            </w:r>
+          </w:p>
+        </w:tc>
+      </w:tr>
+      <w:tr>
+        <w:tblPrEx>
+          <w:tblCellMar>
+            <w:top w:w="0" w:type="dxa"/>
+            <w:left w:w="108" w:type="dxa"/>
+            <w:bottom w:w="0" w:type="dxa"/>
+            <w:right w:w="108" w:type="dxa"/>
+          </w:tblCellMar>
+        </w:tblPrEx>
+        <w:trPr>
+          <w:cantSplit/>
+          <w:jc w:val="center"/>
+        </w:trPr>
+        <w:tc>
+          <w:tcPr>
+            <w:tcW w:w="2400" w:type="dxa"/>
+            <w:tcBorders>
+              <w:top w:val="single" w:color="FFFFFF" w:sz="4" w:space="0"/>
+              <w:left w:val="single" w:color="FFFFFF" w:sz="4" w:space="0"/>
+              <w:bottom w:val="single" w:color="FFFFFF" w:sz="4" w:space="0"/>
+              <w:right w:val="single" w:color="FFFFFF" w:sz="4" w:space="0"/>
+            </w:tcBorders>
+            <w:shd w:val="clear" w:color="auto" w:fill="CFE2F5"/>
+            <w:tcMar>
+              <w:top w:w="50" w:type="dxa"/>
+              <w:left w:w="80" w:type="dxa"/>
+              <w:bottom w:w="50" w:type="dxa"/>
+              <w:right w:w="80" w:type="dxa"/>
+            </w:tcMar>
+          </w:tcPr>
+          <w:p>
+            <w:pPr>
+              <w:jc w:val="center"/>
+            </w:pPr>
+            <w:r>
+              <w:rPr>
+                <w:rFonts w:ascii="Calibri" w:hAnsi="Calibri" w:eastAsia="Calibri" w:cs="Calibri"/>
+                <w:sz w:val="21"/>
+                <w:szCs w:val="21"/>
+              </w:rPr>
+              <w:t>A</w:t>
+            </w:r>
+          </w:p>
+        </w:tc>
+        <w:tc>
+          <w:tcPr>
+            <w:tcW w:w="3000" w:type="dxa"/>
+            <w:tcBorders>
+              <w:top w:val="single" w:color="FFFFFF" w:sz="4" w:space="0"/>
+              <w:left w:val="single" w:color="FFFFFF" w:sz="4" w:space="0"/>
+              <w:bottom w:val="single" w:color="FFFFFF" w:sz="4" w:space="0"/>
+              <w:right w:val="single" w:color="FFFFFF" w:sz="4" w:space="0"/>
+            </w:tcBorders>
+            <w:shd w:val="clear" w:color="auto" w:fill="CFE2F5"/>
+            <w:tcMar>
+              <w:top w:w="50" w:type="dxa"/>
+              <w:left w:w="80" w:type="dxa"/>
+              <w:bottom w:w="50" w:type="dxa"/>
+              <w:right w:w="80" w:type="dxa"/>
+            </w:tcMar>
+          </w:tcPr>
+          <w:p>
+            <w:pPr>
+              <w:jc w:val="center"/>
+            </w:pPr>
+            <w:r>
+              <w:rPr>
+                <w:rFonts w:ascii="Calibri" w:hAnsi="Calibri" w:eastAsia="Calibri" w:cs="Calibri"/>
+                <w:sz w:val="21"/>
+                <w:szCs w:val="21"/>
+              </w:rPr>
+              <w:t>-</w:t>
+            </w:r>
+          </w:p>
+        </w:tc>
+      </w:tr>
+      <w:tr>
+        <w:tblPrEx>
+          <w:tblCellMar>
+            <w:top w:w="0" w:type="dxa"/>
+            <w:left w:w="108" w:type="dxa"/>
+            <w:bottom w:w="0" w:type="dxa"/>
+            <w:right w:w="108" w:type="dxa"/>
+          </w:tblCellMar>
+        </w:tblPrEx>
+        <w:trPr>
+          <w:cantSplit/>
+          <w:jc w:val="center"/>
+        </w:trPr>
+        <w:tc>
+          <w:tcPr>
+            <w:tcW w:w="2400" w:type="dxa"/>
+            <w:tcBorders>
+              <w:top w:val="single" w:color="FFFFFF" w:sz="4" w:space="0"/>
+              <w:left w:val="single" w:color="FFFFFF" w:sz="4" w:space="0"/>
+              <w:bottom w:val="single" w:color="FFFFFF" w:sz="4" w:space="0"/>
+              <w:right w:val="single" w:color="FFFFFF" w:sz="4" w:space="0"/>
+            </w:tcBorders>
+            <w:shd w:val="clear" w:color="auto" w:fill="EAF2FB"/>
+            <w:tcMar>
+              <w:top w:w="50" w:type="dxa"/>
+              <w:left w:w="80" w:type="dxa"/>
+              <w:bottom w:w="50" w:type="dxa"/>
+              <w:right w:w="80" w:type="dxa"/>
+            </w:tcMar>
+          </w:tcPr>
+          <w:p>
+            <w:pPr>
+              <w:jc w:val="center"/>
+            </w:pPr>
+            <w:r>
+              <w:rPr>
+                <w:rFonts w:ascii="Calibri" w:hAnsi="Calibri" w:eastAsia="Calibri" w:cs="Calibri"/>
+                <w:sz w:val="21"/>
+                <w:szCs w:val="21"/>
+              </w:rPr>
+              <w:t>B</w:t>
+            </w:r>
+          </w:p>
+        </w:tc>
+        <w:tc>
+          <w:tcPr>
+            <w:tcW w:w="3000" w:type="dxa"/>
+            <w:tcBorders>
+              <w:top w:val="single" w:color="FFFFFF" w:sz="4" w:space="0"/>
+              <w:left w:val="single" w:color="FFFFFF" w:sz="4" w:space="0"/>
+              <w:bottom w:val="single" w:color="FFFFFF" w:sz="4" w:space="0"/>
+              <w:right w:val="single" w:color="FFFFFF" w:sz="4" w:space="0"/>
+            </w:tcBorders>
+            <w:shd w:val="clear" w:color="auto" w:fill="EAF2FB"/>
+            <w:tcMar>
+              <w:top w:w="50" w:type="dxa"/>
+              <w:left w:w="80" w:type="dxa"/>
+              <w:bottom w:w="50" w:type="dxa"/>
+              <w:right w:w="80" w:type="dxa"/>
+            </w:tcMar>
+          </w:tcPr>
+          <w:p>
+            <w:pPr>
+              <w:jc w:val="center"/>
+            </w:pPr>
+            <w:r>
+              <w:rPr>
+                <w:rFonts w:ascii="Calibri" w:hAnsi="Calibri" w:eastAsia="Calibri" w:cs="Calibri"/>
+                <w:sz w:val="21"/>
+                <w:szCs w:val="21"/>
+              </w:rPr>
+              <w:t>-</w:t>
+            </w:r>
+          </w:p>
+        </w:tc>
+      </w:tr>
+      <w:tr>
+        <w:tblPrEx>
+          <w:tblCellMar>
+            <w:top w:w="0" w:type="dxa"/>
+            <w:left w:w="108" w:type="dxa"/>
+            <w:bottom w:w="0" w:type="dxa"/>
+            <w:right w:w="108" w:type="dxa"/>
+          </w:tblCellMar>
+        </w:tblPrEx>
+        <w:trPr>
+          <w:cantSplit/>
+          <w:jc w:val="center"/>
+        </w:trPr>
+        <w:tc>
+          <w:tcPr>
+            <w:tcW w:w="2400" w:type="dxa"/>
+            <w:tcBorders>
+              <w:top w:val="single" w:color="FFFFFF" w:sz="4" w:space="0"/>
+              <w:left w:val="single" w:color="FFFFFF" w:sz="4" w:space="0"/>
+              <w:bottom w:val="single" w:color="FFFFFF" w:sz="4" w:space="0"/>
+              <w:right w:val="single" w:color="FFFFFF" w:sz="4" w:space="0"/>
+            </w:tcBorders>
+            <w:shd w:val="clear" w:color="auto" w:fill="CFE2F5"/>
+            <w:tcMar>
+              <w:top w:w="50" w:type="dxa"/>
+              <w:left w:w="80" w:type="dxa"/>
+              <w:bottom w:w="50" w:type="dxa"/>
+              <w:right w:w="80" w:type="dxa"/>
+            </w:tcMar>
+          </w:tcPr>
+          <w:p>
+            <w:pPr>
+              <w:jc w:val="center"/>
+            </w:pPr>
+            <w:r>
+              <w:rPr>
+                <w:rFonts w:ascii="Calibri" w:hAnsi="Calibri" w:eastAsia="Calibri" w:cs="Calibri"/>
+                <w:sz w:val="21"/>
+                <w:szCs w:val="21"/>
+              </w:rPr>
+              <w:t>C</w:t>
+            </w:r>
+          </w:p>
+        </w:tc>
+        <w:tc>
+          <w:tcPr>
+            <w:tcW w:w="3000" w:type="dxa"/>
+            <w:tcBorders>
+              <w:top w:val="single" w:color="FFFFFF" w:sz="4" w:space="0"/>
+              <w:left w:val="single" w:color="FFFFFF" w:sz="4" w:space="0"/>
+              <w:bottom w:val="single" w:color="FFFFFF" w:sz="4" w:space="0"/>
+              <w:right w:val="single" w:color="FFFFFF" w:sz="4" w:space="0"/>
+            </w:tcBorders>
+            <w:shd w:val="clear" w:color="auto" w:fill="CFE2F5"/>
+            <w:tcMar>
+              <w:top w:w="50" w:type="dxa"/>
+              <w:left w:w="80" w:type="dxa"/>
+              <w:bottom w:w="50" w:type="dxa"/>
+              <w:right w:w="80" w:type="dxa"/>
+            </w:tcMar>
+          </w:tcPr>
+          <w:p>
+            <w:pPr>
+              <w:jc w:val="center"/>
+            </w:pPr>
+            <w:r>
+              <w:rPr>
+                <w:rFonts w:ascii="Calibri" w:hAnsi="Calibri" w:eastAsia="Calibri" w:cs="Calibri"/>
+                <w:sz w:val="21"/>
+                <w:szCs w:val="21"/>
+              </w:rPr>
+              <w:t>-</w:t>
+            </w:r>
+          </w:p>
+        </w:tc>
+      </w:tr>
+      <w:tr>
+        <w:tblPrEx>
+          <w:tblCellMar>
+            <w:top w:w="0" w:type="dxa"/>
+            <w:left w:w="108" w:type="dxa"/>
+            <w:bottom w:w="0" w:type="dxa"/>
+            <w:right w:w="108" w:type="dxa"/>
+          </w:tblCellMar>
+        </w:tblPrEx>
+        <w:trPr>
+          <w:cantSplit/>
+          <w:jc w:val="center"/>
+        </w:trPr>
+        <w:tc>
+          <w:tcPr>
+            <w:tcW w:w="2400" w:type="dxa"/>
+            <w:tcBorders>
+              <w:top w:val="single" w:color="FFFFFF" w:sz="4" w:space="0"/>
+              <w:left w:val="single" w:color="FFFFFF" w:sz="4" w:space="0"/>
+              <w:bottom w:val="single" w:color="FFFFFF" w:sz="4" w:space="0"/>
+              <w:right w:val="single" w:color="FFFFFF" w:sz="4" w:space="0"/>
+            </w:tcBorders>
+            <w:shd w:val="clear" w:color="auto" w:fill="EAF2FB"/>
+            <w:tcMar>
+              <w:top w:w="50" w:type="dxa"/>
+              <w:left w:w="80" w:type="dxa"/>
+              <w:bottom w:w="50" w:type="dxa"/>
+              <w:right w:w="80" w:type="dxa"/>
+            </w:tcMar>
+          </w:tcPr>
+          <w:p>
+            <w:pPr>
+              <w:jc w:val="center"/>
+            </w:pPr>
+            <w:r>
+              <w:rPr>
+                <w:rFonts w:ascii="Calibri" w:hAnsi="Calibri" w:eastAsia="Calibri" w:cs="Calibri"/>
+                <w:sz w:val="21"/>
+                <w:szCs w:val="21"/>
+              </w:rPr>
+              <w:t>D</w:t>
+            </w:r>
+          </w:p>
+        </w:tc>
+        <w:tc>
+          <w:tcPr>
+            <w:tcW w:w="3000" w:type="dxa"/>
+            <w:tcBorders>
+              <w:top w:val="single" w:color="FFFFFF" w:sz="4" w:space="0"/>
+              <w:left w:val="single" w:color="FFFFFF" w:sz="4" w:space="0"/>
+              <w:bottom w:val="single" w:color="FFFFFF" w:sz="4" w:space="0"/>
+              <w:right w:val="single" w:color="FFFFFF" w:sz="4" w:space="0"/>
+            </w:tcBorders>
+            <w:shd w:val="clear" w:color="auto" w:fill="EAF2FB"/>
+            <w:tcMar>
+              <w:top w:w="50" w:type="dxa"/>
+              <w:left w:w="80" w:type="dxa"/>
+              <w:bottom w:w="50" w:type="dxa"/>
+              <w:right w:w="80" w:type="dxa"/>
+            </w:tcMar>
+          </w:tcPr>
+          <w:p>
+            <w:pPr>
+              <w:jc w:val="center"/>
+            </w:pPr>
+            <w:r>
+              <w:rPr>
+                <w:rFonts w:ascii="Calibri" w:hAnsi="Calibri" w:eastAsia="Calibri" w:cs="Calibri"/>
+                <w:sz w:val="21"/>
+                <w:szCs w:val="21"/>
+              </w:rPr>
+              <w:t>A</w:t>
+            </w:r>
+          </w:p>
+        </w:tc>
+      </w:tr>
+      <w:tr>
+        <w:tblPrEx>
+          <w:tblCellMar>
+            <w:top w:w="0" w:type="dxa"/>
+            <w:left w:w="108" w:type="dxa"/>
+            <w:bottom w:w="0" w:type="dxa"/>
+            <w:right w:w="108" w:type="dxa"/>
+          </w:tblCellMar>
+        </w:tblPrEx>
+        <w:trPr>
+          <w:cantSplit/>
+          <w:jc w:val="center"/>
+        </w:trPr>
+        <w:tc>
+          <w:tcPr>
+            <w:tcW w:w="2400" w:type="dxa"/>
+            <w:tcBorders>
+              <w:top w:val="single" w:color="FFFFFF" w:sz="4" w:space="0"/>
+              <w:left w:val="single" w:color="FFFFFF" w:sz="4" w:space="0"/>
+              <w:bottom w:val="single" w:color="FFFFFF" w:sz="4" w:space="0"/>
+              <w:right w:val="single" w:color="FFFFFF" w:sz="4" w:space="0"/>
+            </w:tcBorders>
+            <w:shd w:val="clear" w:color="auto" w:fill="CFE2F5"/>
+            <w:tcMar>
+              <w:top w:w="50" w:type="dxa"/>
+              <w:left w:w="80" w:type="dxa"/>
+              <w:bottom w:w="50" w:type="dxa"/>
+              <w:right w:w="80" w:type="dxa"/>
+            </w:tcMar>
+          </w:tcPr>
+          <w:p>
+            <w:pPr>
+              <w:jc w:val="center"/>
+            </w:pPr>
+            <w:r>
+              <w:rPr>
+                <w:rFonts w:ascii="Calibri" w:hAnsi="Calibri" w:eastAsia="Calibri" w:cs="Calibri"/>
+                <w:sz w:val="21"/>
+                <w:szCs w:val="21"/>
+              </w:rPr>
+              <w:t>E</w:t>
+            </w:r>
+          </w:p>
+        </w:tc>
+        <w:tc>
+          <w:tcPr>
+            <w:tcW w:w="3000" w:type="dxa"/>
+            <w:tcBorders>
+              <w:top w:val="single" w:color="FFFFFF" w:sz="4" w:space="0"/>
+              <w:left w:val="single" w:color="FFFFFF" w:sz="4" w:space="0"/>
+              <w:bottom w:val="single" w:color="FFFFFF" w:sz="4" w:space="0"/>
+              <w:right w:val="single" w:color="FFFFFF" w:sz="4" w:space="0"/>
+            </w:tcBorders>
+            <w:shd w:val="clear" w:color="auto" w:fill="CFE2F5"/>
+            <w:tcMar>
+              <w:top w:w="50" w:type="dxa"/>
+              <w:left w:w="80" w:type="dxa"/>
+              <w:bottom w:w="50" w:type="dxa"/>
+              <w:right w:w="80" w:type="dxa"/>
+            </w:tcMar>
+          </w:tcPr>
+          <w:p>
+            <w:pPr>
+              <w:jc w:val="center"/>
+            </w:pPr>
+            <w:r>
+              <w:rPr>
+                <w:rFonts w:ascii="Calibri" w:hAnsi="Calibri" w:eastAsia="Calibri" w:cs="Calibri"/>
+                <w:sz w:val="21"/>
+                <w:szCs w:val="21"/>
+              </w:rPr>
+              <w:t>C</w:t>
+            </w:r>
+          </w:p>
+        </w:tc>
+      </w:tr>
+      <w:tr>
+        <w:tblPrEx>
+          <w:tblCellMar>
+            <w:top w:w="0" w:type="dxa"/>
+            <w:left w:w="108" w:type="dxa"/>
+            <w:bottom w:w="0" w:type="dxa"/>
+            <w:right w:w="108" w:type="dxa"/>
+          </w:tblCellMar>
+        </w:tblPrEx>
+        <w:trPr>
+          <w:cantSplit/>
+          <w:jc w:val="center"/>
+        </w:trPr>
+        <w:tc>
+          <w:tcPr>
+            <w:tcW w:w="2400" w:type="dxa"/>
+            <w:tcBorders>
+              <w:top w:val="single" w:color="FFFFFF" w:sz="4" w:space="0"/>
+              <w:left w:val="single" w:color="FFFFFF" w:sz="4" w:space="0"/>
+              <w:bottom w:val="single" w:color="FFFFFF" w:sz="4" w:space="0"/>
+              <w:right w:val="single" w:color="FFFFFF" w:sz="4" w:space="0"/>
+            </w:tcBorders>
+            <w:shd w:val="clear" w:color="auto" w:fill="EAF2FB"/>
+            <w:tcMar>
+              <w:top w:w="50" w:type="dxa"/>
+              <w:left w:w="80" w:type="dxa"/>
+              <w:bottom w:w="50" w:type="dxa"/>
+              <w:right w:w="80" w:type="dxa"/>
+            </w:tcMar>
+          </w:tcPr>
+          <w:p>
+            <w:pPr>
+              <w:jc w:val="center"/>
+            </w:pPr>
+            <w:r>
+              <w:rPr>
+                <w:rFonts w:ascii="Calibri" w:hAnsi="Calibri" w:eastAsia="Calibri" w:cs="Calibri"/>
+                <w:sz w:val="21"/>
+                <w:szCs w:val="21"/>
+              </w:rPr>
+              <w:t>F</w:t>
+            </w:r>
+          </w:p>
+        </w:tc>
+        <w:tc>
+          <w:tcPr>
+            <w:tcW w:w="3000" w:type="dxa"/>
+            <w:tcBorders>
+              <w:top w:val="single" w:color="FFFFFF" w:sz="4" w:space="0"/>
+              <w:left w:val="single" w:color="FFFFFF" w:sz="4" w:space="0"/>
+              <w:bottom w:val="single" w:color="FFFFFF" w:sz="4" w:space="0"/>
+              <w:right w:val="single" w:color="FFFFFF" w:sz="4" w:space="0"/>
+            </w:tcBorders>
+            <w:shd w:val="clear" w:color="auto" w:fill="EAF2FB"/>
+            <w:tcMar>
+              <w:top w:w="50" w:type="dxa"/>
+              <w:left w:w="80" w:type="dxa"/>
+              <w:bottom w:w="50" w:type="dxa"/>
+              <w:right w:w="80" w:type="dxa"/>
+            </w:tcMar>
+          </w:tcPr>
+          <w:p>
+            <w:pPr>
+              <w:jc w:val="center"/>
+            </w:pPr>
+            <w:r>
+              <w:rPr>
+                <w:rFonts w:ascii="Calibri" w:hAnsi="Calibri" w:eastAsia="Calibri" w:cs="Calibri"/>
+                <w:sz w:val="21"/>
+                <w:szCs w:val="21"/>
+              </w:rPr>
+              <w:t>B, D</w:t>
+            </w:r>
+          </w:p>
+        </w:tc>
+      </w:tr>
+      <w:tr>
+        <w:tblPrEx>
+          <w:tblCellMar>
+            <w:top w:w="0" w:type="dxa"/>
+            <w:left w:w="108" w:type="dxa"/>
+            <w:bottom w:w="0" w:type="dxa"/>
+            <w:right w:w="108" w:type="dxa"/>
+          </w:tblCellMar>
+        </w:tblPrEx>
+        <w:trPr>
+          <w:cantSplit/>
+          <w:jc w:val="center"/>
+        </w:trPr>
+        <w:tc>
+          <w:tcPr>
+            <w:tcW w:w="2400" w:type="dxa"/>
+            <w:tcBorders>
+              <w:top w:val="single" w:color="FFFFFF" w:sz="4" w:space="0"/>
+              <w:left w:val="single" w:color="FFFFFF" w:sz="4" w:space="0"/>
+              <w:bottom w:val="single" w:color="FFFFFF" w:sz="4" w:space="0"/>
+              <w:right w:val="single" w:color="FFFFFF" w:sz="4" w:space="0"/>
+            </w:tcBorders>
+            <w:shd w:val="clear" w:color="auto" w:fill="CFE2F5"/>
+            <w:tcMar>
+              <w:top w:w="50" w:type="dxa"/>
+              <w:left w:w="80" w:type="dxa"/>
+              <w:bottom w:w="50" w:type="dxa"/>
+              <w:right w:w="80" w:type="dxa"/>
+            </w:tcMar>
+          </w:tcPr>
+          <w:p>
+            <w:pPr>
+              <w:jc w:val="center"/>
+            </w:pPr>
+            <w:r>
+              <w:rPr>
+                <w:rFonts w:ascii="Calibri" w:hAnsi="Calibri" w:eastAsia="Calibri" w:cs="Calibri"/>
+                <w:sz w:val="21"/>
+                <w:szCs w:val="21"/>
+              </w:rPr>
+              <w:t>G</w:t>
+            </w:r>
+          </w:p>
+        </w:tc>
+        <w:tc>
+          <w:tcPr>
+            <w:tcW w:w="3000" w:type="dxa"/>
+            <w:tcBorders>
+              <w:top w:val="single" w:color="FFFFFF" w:sz="4" w:space="0"/>
+              <w:left w:val="single" w:color="FFFFFF" w:sz="4" w:space="0"/>
+              <w:bottom w:val="single" w:color="FFFFFF" w:sz="4" w:space="0"/>
+              <w:right w:val="single" w:color="FFFFFF" w:sz="4" w:space="0"/>
+            </w:tcBorders>
+            <w:shd w:val="clear" w:color="auto" w:fill="CFE2F5"/>
+            <w:tcMar>
+              <w:top w:w="50" w:type="dxa"/>
+              <w:left w:w="80" w:type="dxa"/>
+              <w:bottom w:w="50" w:type="dxa"/>
+              <w:right w:w="80" w:type="dxa"/>
+            </w:tcMar>
+          </w:tcPr>
+          <w:p>
+            <w:pPr>
+              <w:jc w:val="center"/>
+            </w:pPr>
+            <w:r>
+              <w:rPr>
+                <w:rFonts w:ascii="Calibri" w:hAnsi="Calibri" w:eastAsia="Calibri" w:cs="Calibri"/>
+                <w:sz w:val="21"/>
+                <w:szCs w:val="21"/>
+              </w:rPr>
+              <w:t>B, D</w:t>
+            </w:r>
+          </w:p>
+        </w:tc>
+      </w:tr>
+      <w:tr>
+        <w:tblPrEx>
+          <w:tblCellMar>
+            <w:top w:w="0" w:type="dxa"/>
+            <w:left w:w="108" w:type="dxa"/>
+            <w:bottom w:w="0" w:type="dxa"/>
+            <w:right w:w="108" w:type="dxa"/>
+          </w:tblCellMar>
+        </w:tblPrEx>
+        <w:trPr>
+          <w:cantSplit/>
+          <w:jc w:val="center"/>
+        </w:trPr>
+        <w:tc>
+          <w:tcPr>
+            <w:tcW w:w="2400" w:type="dxa"/>
+            <w:tcBorders>
+              <w:top w:val="single" w:color="FFFFFF" w:sz="4" w:space="0"/>
+              <w:left w:val="single" w:color="FFFFFF" w:sz="4" w:space="0"/>
+              <w:bottom w:val="single" w:color="FFFFFF" w:sz="4" w:space="0"/>
+              <w:right w:val="single" w:color="FFFFFF" w:sz="4" w:space="0"/>
+            </w:tcBorders>
+            <w:shd w:val="clear" w:color="auto" w:fill="EAF2FB"/>
+            <w:tcMar>
+              <w:top w:w="50" w:type="dxa"/>
+              <w:left w:w="80" w:type="dxa"/>
+              <w:bottom w:w="50" w:type="dxa"/>
+              <w:right w:w="80" w:type="dxa"/>
+            </w:tcMar>
+          </w:tcPr>
+          <w:p>
+            <w:pPr>
+              <w:jc w:val="center"/>
+            </w:pPr>
+            <w:r>
+              <w:rPr>
+                <w:rFonts w:ascii="Calibri" w:hAnsi="Calibri" w:eastAsia="Calibri" w:cs="Calibri"/>
+                <w:sz w:val="21"/>
+                <w:szCs w:val="21"/>
+              </w:rPr>
+              <w:t>H</w:t>
+            </w:r>
+          </w:p>
+        </w:tc>
+        <w:tc>
+          <w:tcPr>
+            <w:tcW w:w="3000" w:type="dxa"/>
+            <w:tcBorders>
+              <w:top w:val="single" w:color="FFFFFF" w:sz="4" w:space="0"/>
+              <w:left w:val="single" w:color="FFFFFF" w:sz="4" w:space="0"/>
+              <w:bottom w:val="single" w:color="FFFFFF" w:sz="4" w:space="0"/>
+              <w:right w:val="single" w:color="FFFFFF" w:sz="4" w:space="0"/>
+            </w:tcBorders>
+            <w:shd w:val="clear" w:color="auto" w:fill="EAF2FB"/>
+            <w:tcMar>
+              <w:top w:w="50" w:type="dxa"/>
+              <w:left w:w="80" w:type="dxa"/>
+              <w:bottom w:w="50" w:type="dxa"/>
+              <w:right w:w="80" w:type="dxa"/>
+            </w:tcMar>
+          </w:tcPr>
+          <w:p>
+            <w:pPr>
+              <w:jc w:val="center"/>
+            </w:pPr>
+            <w:r>
+              <w:rPr>
+                <w:rFonts w:ascii="Calibri" w:hAnsi="Calibri" w:eastAsia="Calibri" w:cs="Calibri"/>
+                <w:sz w:val="21"/>
+                <w:szCs w:val="21"/>
+              </w:rPr>
+              <w:t>E, F</w:t>
+            </w:r>
+          </w:p>
+        </w:tc>
+      </w:tr>
+      <w:tr>
+        <w:tblPrEx>
+          <w:tblCellMar>
+            <w:top w:w="0" w:type="dxa"/>
+            <w:left w:w="108" w:type="dxa"/>
+            <w:bottom w:w="0" w:type="dxa"/>
+            <w:right w:w="108" w:type="dxa"/>
+          </w:tblCellMar>
+        </w:tblPrEx>
+        <w:trPr>
+          <w:cantSplit/>
+          <w:jc w:val="center"/>
+        </w:trPr>
+        <w:tc>
+          <w:tcPr>
+            <w:tcW w:w="2400" w:type="dxa"/>
+            <w:tcBorders>
+              <w:top w:val="single" w:color="FFFFFF" w:sz="4" w:space="0"/>
+              <w:left w:val="single" w:color="FFFFFF" w:sz="4" w:space="0"/>
+              <w:bottom w:val="single" w:color="FFFFFF" w:sz="4" w:space="0"/>
+              <w:right w:val="single" w:color="FFFFFF" w:sz="4" w:space="0"/>
+            </w:tcBorders>
+            <w:shd w:val="clear" w:color="auto" w:fill="CFE2F5"/>
+            <w:tcMar>
+              <w:top w:w="50" w:type="dxa"/>
+              <w:left w:w="80" w:type="dxa"/>
+              <w:bottom w:w="50" w:type="dxa"/>
+              <w:right w:w="80" w:type="dxa"/>
+            </w:tcMar>
+          </w:tcPr>
+          <w:p>
+            <w:pPr>
+              <w:jc w:val="center"/>
+            </w:pPr>
+            <w:r>
+              <w:rPr>
+                <w:rFonts w:ascii="Calibri" w:hAnsi="Calibri" w:eastAsia="Calibri" w:cs="Calibri"/>
+                <w:sz w:val="21"/>
+                <w:szCs w:val="21"/>
+              </w:rPr>
+              <w:t>I</w:t>
+            </w:r>
+          </w:p>
+        </w:tc>
+        <w:tc>
+          <w:tcPr>
+            <w:tcW w:w="3000" w:type="dxa"/>
+            <w:tcBorders>
+              <w:top w:val="single" w:color="FFFFFF" w:sz="4" w:space="0"/>
+              <w:left w:val="single" w:color="FFFFFF" w:sz="4" w:space="0"/>
+              <w:bottom w:val="single" w:color="FFFFFF" w:sz="4" w:space="0"/>
+              <w:right w:val="single" w:color="FFFFFF" w:sz="4" w:space="0"/>
+            </w:tcBorders>
+            <w:shd w:val="clear" w:color="auto" w:fill="CFE2F5"/>
+            <w:tcMar>
+              <w:top w:w="50" w:type="dxa"/>
+              <w:left w:w="80" w:type="dxa"/>
+              <w:bottom w:w="50" w:type="dxa"/>
+              <w:right w:w="80" w:type="dxa"/>
+            </w:tcMar>
+          </w:tcPr>
+          <w:p>
+            <w:pPr>
+              <w:jc w:val="center"/>
+            </w:pPr>
+            <w:r>
+              <w:rPr>
+                <w:rFonts w:ascii="Calibri" w:hAnsi="Calibri" w:eastAsia="Calibri" w:cs="Calibri"/>
+                <w:sz w:val="21"/>
+                <w:szCs w:val="21"/>
+              </w:rPr>
+              <w:t>A</w:t>
+            </w:r>
+          </w:p>
+        </w:tc>
+      </w:tr>
+      <w:tr>
+        <w:tblPrEx>
+          <w:tblCellMar>
+            <w:top w:w="0" w:type="dxa"/>
+            <w:left w:w="108" w:type="dxa"/>
+            <w:bottom w:w="0" w:type="dxa"/>
+            <w:right w:w="108" w:type="dxa"/>
+          </w:tblCellMar>
+        </w:tblPrEx>
+        <w:trPr>
+          <w:cantSplit/>
+          <w:jc w:val="center"/>
+        </w:trPr>
+        <w:tc>
+          <w:tcPr>
+            <w:tcW w:w="2400" w:type="dxa"/>
+            <w:tcBorders>
+              <w:top w:val="single" w:color="FFFFFF" w:sz="4" w:space="0"/>
+              <w:left w:val="single" w:color="FFFFFF" w:sz="4" w:space="0"/>
+              <w:bottom w:val="single" w:color="FFFFFF" w:sz="4" w:space="0"/>
+              <w:right w:val="single" w:color="FFFFFF" w:sz="4" w:space="0"/>
+            </w:tcBorders>
+            <w:shd w:val="clear" w:color="auto" w:fill="EAF2FB"/>
+            <w:tcMar>
+              <w:top w:w="50" w:type="dxa"/>
+              <w:left w:w="80" w:type="dxa"/>
+              <w:bottom w:w="50" w:type="dxa"/>
+              <w:right w:w="80" w:type="dxa"/>
+            </w:tcMar>
+          </w:tcPr>
+          <w:p>
+            <w:pPr>
+              <w:jc w:val="center"/>
+            </w:pPr>
+            <w:r>
+              <w:rPr>
+                <w:rFonts w:ascii="Calibri" w:hAnsi="Calibri" w:eastAsia="Calibri" w:cs="Calibri"/>
+                <w:sz w:val="21"/>
+                <w:szCs w:val="21"/>
+              </w:rPr>
+              <w:t>J</w:t>
+            </w:r>
+          </w:p>
+        </w:tc>
+        <w:tc>
+          <w:tcPr>
+            <w:tcW w:w="3000" w:type="dxa"/>
+            <w:tcBorders>
+              <w:top w:val="single" w:color="FFFFFF" w:sz="4" w:space="0"/>
+              <w:left w:val="single" w:color="FFFFFF" w:sz="4" w:space="0"/>
+              <w:bottom w:val="single" w:color="FFFFFF" w:sz="4" w:space="0"/>
+              <w:right w:val="single" w:color="FFFFFF" w:sz="4" w:space="0"/>
+            </w:tcBorders>
+            <w:shd w:val="clear" w:color="auto" w:fill="EAF2FB"/>
+            <w:tcMar>
+              <w:top w:w="50" w:type="dxa"/>
+              <w:left w:w="80" w:type="dxa"/>
+              <w:bottom w:w="50" w:type="dxa"/>
+              <w:right w:w="80" w:type="dxa"/>
+            </w:tcMar>
+          </w:tcPr>
+          <w:p>
+            <w:pPr>
+              <w:jc w:val="center"/>
+            </w:pPr>
+            <w:r>
+              <w:rPr>
+                <w:rFonts w:ascii="Calibri" w:hAnsi="Calibri" w:eastAsia="Calibri" w:cs="Calibri"/>
+                <w:sz w:val="21"/>
+                <w:szCs w:val="21"/>
+              </w:rPr>
+              <w:t>G, H</w:t>
+            </w:r>
+          </w:p>
+        </w:tc>
+      </w:tr>
+      <w:tr>
+        <w:tblPrEx>
+          <w:tblCellMar>
+            <w:top w:w="0" w:type="dxa"/>
+            <w:left w:w="108" w:type="dxa"/>
+            <w:bottom w:w="0" w:type="dxa"/>
+            <w:right w:w="108" w:type="dxa"/>
+          </w:tblCellMar>
+        </w:tblPrEx>
+        <w:trPr>
+          <w:cantSplit/>
+          <w:jc w:val="center"/>
+        </w:trPr>
+        <w:tc>
+          <w:tcPr>
+            <w:tcW w:w="2400" w:type="dxa"/>
+            <w:tcBorders>
+              <w:top w:val="single" w:color="FFFFFF" w:sz="4" w:space="0"/>
+              <w:left w:val="single" w:color="FFFFFF" w:sz="4" w:space="0"/>
+              <w:bottom w:val="single" w:color="FFFFFF" w:sz="4" w:space="0"/>
+              <w:right w:val="single" w:color="FFFFFF" w:sz="4" w:space="0"/>
+            </w:tcBorders>
+            <w:shd w:val="clear" w:color="auto" w:fill="CFE2F5"/>
+            <w:tcMar>
+              <w:top w:w="50" w:type="dxa"/>
+              <w:left w:w="80" w:type="dxa"/>
+              <w:bottom w:w="50" w:type="dxa"/>
+              <w:right w:w="80" w:type="dxa"/>
+            </w:tcMar>
+          </w:tcPr>
+          <w:p>
+            <w:pPr>
+              <w:jc w:val="center"/>
+            </w:pPr>
+            <w:r>
+              <w:rPr>
+                <w:rFonts w:ascii="Calibri" w:hAnsi="Calibri" w:eastAsia="Calibri" w:cs="Calibri"/>
+                <w:sz w:val="21"/>
+                <w:szCs w:val="21"/>
+              </w:rPr>
+              <w:t>K</w:t>
+            </w:r>
+          </w:p>
+        </w:tc>
+        <w:tc>
+          <w:tcPr>
+            <w:tcW w:w="3000" w:type="dxa"/>
+            <w:tcBorders>
+              <w:top w:val="single" w:color="FFFFFF" w:sz="4" w:space="0"/>
+              <w:left w:val="single" w:color="FFFFFF" w:sz="4" w:space="0"/>
+              <w:bottom w:val="single" w:color="FFFFFF" w:sz="4" w:space="0"/>
+              <w:right w:val="single" w:color="FFFFFF" w:sz="4" w:space="0"/>
+            </w:tcBorders>
+            <w:shd w:val="clear" w:color="auto" w:fill="CFE2F5"/>
+            <w:tcMar>
+              <w:top w:w="50" w:type="dxa"/>
+              <w:left w:w="80" w:type="dxa"/>
+              <w:bottom w:w="50" w:type="dxa"/>
+              <w:right w:w="80" w:type="dxa"/>
+            </w:tcMar>
+          </w:tcPr>
+          <w:p>
+            <w:pPr>
+              <w:jc w:val="center"/>
+            </w:pPr>
+            <w:r>
+              <w:rPr>
+                <w:rFonts w:ascii="Calibri" w:hAnsi="Calibri" w:eastAsia="Calibri" w:cs="Calibri"/>
+                <w:sz w:val="21"/>
+                <w:szCs w:val="21"/>
+              </w:rPr>
+              <w:t>E, F</w:t>
+            </w:r>
+          </w:p>
+        </w:tc>
+      </w:tr>
+    </w:tbl>
+    <w:p>
+      <w:pPr>
+        <w:keepNext/>
+        <w:spacing w:before="200" w:after="100"/>
+      </w:pPr>
+      <w:r>
+        <w:rPr>
+          <w:rFonts w:ascii="Calibri" w:hAnsi="Calibri" w:eastAsia="Calibri" w:cs="Calibri"/>
+          <w:b/>
+          <w:bCs/>
+          <w:color w:val="1F4E79"/>
+          <w:sz w:val="26"/>
+          <w:szCs w:val="26"/>
+        </w:rPr>
+        <w:t>Answer</w:t>
+      </w:r>
+    </w:p>
+    <w:p>
+      <w:pPr>
+        <w:spacing w:before="120" w:after="120"/>
+        <w:jc w:val="center"/>
+      </w:pPr>
+      <w:r>
+        <w:drawing>
+          <wp:inline distT="0" distB="0" distL="0" distR="0">
+            <wp:extent cx="5852160" cy="2663825"/>
+            <wp:effectExtent l="0" t="0" r="15240" b="3175"/>
+            <wp:docPr id="902" name="pert_fig2.png" descr="pert_fig2.png"/>
+            <wp:cNvGraphicFramePr>
+              <a:graphicFrameLocks xmlns:a="http://schemas.openxmlformats.org/drawingml/2006/main" noChangeAspect="1"/>
+            </wp:cNvGraphicFramePr>
+            <a:graphic xmlns:a="http://schemas.openxmlformats.org/drawingml/2006/main">
+              <a:graphicData uri="http://schemas.openxmlformats.org/drawingml/2006/picture">
+                <pic:pic xmlns:pic="http://schemas.openxmlformats.org/drawingml/2006/picture">
+                  <pic:nvPicPr>
+                    <pic:cNvPr id="902" name="pert_fig2.png" descr="pert_fig2.png"/>
+                    <pic:cNvPicPr>
+                      <a:picLocks noChangeAspect="1"/>
+                    </pic:cNvPicPr>
+                  </pic:nvPicPr>
+                  <pic:blipFill>
+                    <a:blip r:embed="rId7"/>
+                    <a:stretch>
+                      <a:fillRect/>
+                    </a:stretch>
+                  </pic:blipFill>
+                  <pic:spPr>
+                    <a:xfrm>
+                      <a:off x="0" y="0"/>
+                      <a:ext cx="5852160" cy="2664042"/>
+                    </a:xfrm>
+                    <a:prstGeom prst="rect">
+                      <a:avLst/>
+                    </a:prstGeom>
+                  </pic:spPr>
+                </pic:pic>
+              </a:graphicData>
+            </a:graphic>
+          </wp:inline>
+        </w:drawing>
+      </w:r>
+    </w:p>
+    <w:p>
+      <w:pPr>
+        <w:pStyle w:val="3"/>
+        <w:pageBreakBefore/>
+      </w:pPr>
+      <w:r>
+        <w:t>Task 3</w:t>
+      </w:r>
+    </w:p>
+    <w:p>
+      <w:pPr>
+        <w:spacing w:after="120"/>
+      </w:pPr>
+      <w:r>
+        <w:rPr>
+          <w:rFonts w:ascii="Calibri" w:hAnsi="Calibri" w:eastAsia="Calibri" w:cs="Calibri"/>
+          <w:sz w:val="22"/>
+          <w:szCs w:val="22"/>
+        </w:rPr>
+        <w:t>For the following activities, draw the P</w:t>
+      </w:r>
+      <w:r>
+        <w:rPr>
+          <w:rFonts w:hint="default" w:cs="Calibri"/>
+          <w:sz w:val="22"/>
+          <w:szCs w:val="22"/>
+          <w:lang w:val="en-US"/>
+        </w:rPr>
+        <w:t>ert</w:t>
+      </w:r>
+      <w:r>
+        <w:rPr>
+          <w:rFonts w:ascii="Calibri" w:hAnsi="Calibri" w:eastAsia="Calibri" w:cs="Calibri"/>
+          <w:sz w:val="22"/>
+          <w:szCs w:val="22"/>
+        </w:rPr>
+        <w:t xml:space="preserve"> and</w:t>
+      </w:r>
+      <w:r>
+        <w:rPr>
+          <w:rFonts w:hint="default" w:cs="Calibri"/>
+          <w:sz w:val="22"/>
+          <w:szCs w:val="22"/>
+          <w:lang w:val="en-US"/>
+        </w:rPr>
+        <w:t xml:space="preserve"> </w:t>
+      </w:r>
+      <w:r>
+        <w:rPr>
+          <w:rFonts w:ascii="Calibri" w:hAnsi="Calibri" w:eastAsia="Calibri" w:cs="Calibri"/>
+          <w:sz w:val="22"/>
+          <w:szCs w:val="22"/>
+        </w:rPr>
+        <w:t>Gantt chart, then determine the minimum project duration and the critical path:</w:t>
+      </w:r>
+    </w:p>
+    <w:tbl>
+      <w:tblPr>
+        <w:tblStyle w:val="9"/>
+        <w:tblW w:w="7200" w:type="dxa"/>
+        <w:jc w:val="center"/>
+        <w:tblLayout w:type="fixed"/>
+        <w:tblCellMar>
+          <w:top w:w="0" w:type="dxa"/>
+          <w:left w:w="108" w:type="dxa"/>
+          <w:bottom w:w="0" w:type="dxa"/>
+          <w:right w:w="108" w:type="dxa"/>
+        </w:tblCellMar>
+      </w:tblPr>
+      <w:tblGrid>
+        <w:gridCol w:w="2000"/>
+        <w:gridCol w:w="2200"/>
+        <w:gridCol w:w="3000"/>
+      </w:tblGrid>
+      <w:tr>
+        <w:tblPrEx>
+          <w:tblCellMar>
+            <w:top w:w="0" w:type="dxa"/>
+            <w:left w:w="108" w:type="dxa"/>
+            <w:bottom w:w="0" w:type="dxa"/>
+            <w:right w:w="108" w:type="dxa"/>
+          </w:tblCellMar>
+        </w:tblPrEx>
+        <w:trPr>
+          <w:cantSplit/>
+          <w:tblHeader/>
+          <w:jc w:val="center"/>
+        </w:trPr>
+        <w:tc>
+          <w:tcPr>
+            <w:tcW w:w="2000" w:type="dxa"/>
+            <w:tcBorders>
+              <w:top w:val="single" w:color="FFFFFF" w:sz="4" w:space="0"/>
+              <w:left w:val="single" w:color="FFFFFF" w:sz="4" w:space="0"/>
+              <w:bottom w:val="single" w:color="FFFFFF" w:sz="4" w:space="0"/>
+              <w:right w:val="single" w:color="FFFFFF" w:sz="4" w:space="0"/>
+            </w:tcBorders>
+            <w:shd w:val="clear" w:color="auto" w:fill="1F4E79"/>
+            <w:tcMar>
+              <w:top w:w="50" w:type="dxa"/>
+              <w:left w:w="80" w:type="dxa"/>
+              <w:bottom w:w="50" w:type="dxa"/>
+              <w:right w:w="80" w:type="dxa"/>
+            </w:tcMar>
+          </w:tcPr>
+          <w:p>
+            <w:pPr>
+              <w:jc w:val="center"/>
+            </w:pPr>
+            <w:r>
+              <w:rPr>
+                <w:rFonts w:ascii="Calibri" w:hAnsi="Calibri" w:eastAsia="Calibri" w:cs="Calibri"/>
+                <w:b/>
+                <w:bCs/>
+                <w:color w:val="FFFFFF"/>
+                <w:sz w:val="21"/>
+                <w:szCs w:val="21"/>
+              </w:rPr>
+              <w:t>Activity</w:t>
+            </w:r>
+          </w:p>
+        </w:tc>
+        <w:tc>
+          <w:tcPr>
+            <w:tcW w:w="2200" w:type="dxa"/>
+            <w:tcBorders>
+              <w:top w:val="single" w:color="FFFFFF" w:sz="4" w:space="0"/>
+              <w:left w:val="single" w:color="FFFFFF" w:sz="4" w:space="0"/>
+              <w:bottom w:val="single" w:color="FFFFFF" w:sz="4" w:space="0"/>
+              <w:right w:val="single" w:color="FFFFFF" w:sz="4" w:space="0"/>
+            </w:tcBorders>
+            <w:shd w:val="clear" w:color="auto" w:fill="1F4E79"/>
+            <w:tcMar>
+              <w:top w:w="50" w:type="dxa"/>
+              <w:left w:w="80" w:type="dxa"/>
+              <w:bottom w:w="50" w:type="dxa"/>
+              <w:right w:w="80" w:type="dxa"/>
+            </w:tcMar>
+          </w:tcPr>
+          <w:p>
+            <w:pPr>
+              <w:jc w:val="center"/>
+            </w:pPr>
+            <w:r>
+              <w:rPr>
+                <w:rFonts w:ascii="Calibri" w:hAnsi="Calibri" w:eastAsia="Calibri" w:cs="Calibri"/>
+                <w:b/>
+                <w:bCs/>
+                <w:color w:val="FFFFFF"/>
+                <w:sz w:val="21"/>
+                <w:szCs w:val="21"/>
+              </w:rPr>
+              <w:t>Duration (Days)</w:t>
+            </w:r>
+          </w:p>
+        </w:tc>
+        <w:tc>
+          <w:tcPr>
+            <w:tcW w:w="3000" w:type="dxa"/>
+            <w:tcBorders>
+              <w:top w:val="single" w:color="FFFFFF" w:sz="4" w:space="0"/>
+              <w:left w:val="single" w:color="FFFFFF" w:sz="4" w:space="0"/>
+              <w:bottom w:val="single" w:color="FFFFFF" w:sz="4" w:space="0"/>
+              <w:right w:val="single" w:color="FFFFFF" w:sz="4" w:space="0"/>
+            </w:tcBorders>
+            <w:shd w:val="clear" w:color="auto" w:fill="1F4E79"/>
+            <w:tcMar>
+              <w:top w:w="50" w:type="dxa"/>
+              <w:left w:w="80" w:type="dxa"/>
+              <w:bottom w:w="50" w:type="dxa"/>
+              <w:right w:w="80" w:type="dxa"/>
+            </w:tcMar>
+          </w:tcPr>
+          <w:p>
+            <w:pPr>
+              <w:jc w:val="center"/>
+            </w:pPr>
+            <w:r>
+              <w:rPr>
+                <w:rFonts w:ascii="Calibri" w:hAnsi="Calibri" w:eastAsia="Calibri" w:cs="Calibri"/>
+                <w:b/>
+                <w:bCs/>
+                <w:color w:val="FFFFFF"/>
+                <w:sz w:val="21"/>
+                <w:szCs w:val="21"/>
+              </w:rPr>
+              <w:t>Predecessor</w:t>
+            </w:r>
+          </w:p>
+        </w:tc>
+      </w:tr>
+      <w:tr>
+        <w:tblPrEx>
+          <w:tblCellMar>
+            <w:top w:w="0" w:type="dxa"/>
+            <w:left w:w="108" w:type="dxa"/>
+            <w:bottom w:w="0" w:type="dxa"/>
+            <w:right w:w="108" w:type="dxa"/>
+          </w:tblCellMar>
+        </w:tblPrEx>
+        <w:trPr>
+          <w:cantSplit/>
+          <w:jc w:val="center"/>
+        </w:trPr>
+        <w:tc>
+          <w:tcPr>
+            <w:tcW w:w="2000" w:type="dxa"/>
+            <w:tcBorders>
+              <w:top w:val="single" w:color="FFFFFF" w:sz="4" w:space="0"/>
+              <w:left w:val="single" w:color="FFFFFF" w:sz="4" w:space="0"/>
+              <w:bottom w:val="single" w:color="FFFFFF" w:sz="4" w:space="0"/>
+              <w:right w:val="single" w:color="FFFFFF" w:sz="4" w:space="0"/>
+            </w:tcBorders>
+            <w:shd w:val="clear" w:color="auto" w:fill="CFE2F5"/>
+            <w:tcMar>
+              <w:top w:w="50" w:type="dxa"/>
+              <w:left w:w="80" w:type="dxa"/>
+              <w:bottom w:w="50" w:type="dxa"/>
+              <w:right w:w="80" w:type="dxa"/>
+            </w:tcMar>
+          </w:tcPr>
+          <w:p>
+            <w:pPr>
+              <w:jc w:val="center"/>
+            </w:pPr>
+            <w:r>
+              <w:rPr>
+                <w:rFonts w:ascii="Calibri" w:hAnsi="Calibri" w:eastAsia="Calibri" w:cs="Calibri"/>
+                <w:sz w:val="21"/>
+                <w:szCs w:val="21"/>
+              </w:rPr>
+              <w:t>T1</w:t>
+            </w:r>
+          </w:p>
+        </w:tc>
+        <w:tc>
+          <w:tcPr>
+            <w:tcW w:w="2200" w:type="dxa"/>
+            <w:tcBorders>
+              <w:top w:val="single" w:color="FFFFFF" w:sz="4" w:space="0"/>
+              <w:left w:val="single" w:color="FFFFFF" w:sz="4" w:space="0"/>
+              <w:bottom w:val="single" w:color="FFFFFF" w:sz="4" w:space="0"/>
+              <w:right w:val="single" w:color="FFFFFF" w:sz="4" w:space="0"/>
+            </w:tcBorders>
+            <w:shd w:val="clear" w:color="auto" w:fill="CFE2F5"/>
+            <w:tcMar>
+              <w:top w:w="50" w:type="dxa"/>
+              <w:left w:w="80" w:type="dxa"/>
+              <w:bottom w:w="50" w:type="dxa"/>
+              <w:right w:w="80" w:type="dxa"/>
+            </w:tcMar>
+          </w:tcPr>
+          <w:p>
+            <w:pPr>
+              <w:jc w:val="center"/>
+            </w:pPr>
+            <w:r>
+              <w:rPr>
+                <w:rFonts w:ascii="Calibri" w:hAnsi="Calibri" w:eastAsia="Calibri" w:cs="Calibri"/>
+                <w:sz w:val="21"/>
+                <w:szCs w:val="21"/>
+              </w:rPr>
+              <w:t>8</w:t>
+            </w:r>
+          </w:p>
+        </w:tc>
+        <w:tc>
+          <w:tcPr>
+            <w:tcW w:w="3000" w:type="dxa"/>
+            <w:tcBorders>
+              <w:top w:val="single" w:color="FFFFFF" w:sz="4" w:space="0"/>
+              <w:left w:val="single" w:color="FFFFFF" w:sz="4" w:space="0"/>
+              <w:bottom w:val="single" w:color="FFFFFF" w:sz="4" w:space="0"/>
+              <w:right w:val="single" w:color="FFFFFF" w:sz="4" w:space="0"/>
+            </w:tcBorders>
+            <w:shd w:val="clear" w:color="auto" w:fill="CFE2F5"/>
+            <w:tcMar>
+              <w:top w:w="50" w:type="dxa"/>
+              <w:left w:w="80" w:type="dxa"/>
+              <w:bottom w:w="50" w:type="dxa"/>
+              <w:right w:w="80" w:type="dxa"/>
+            </w:tcMar>
+          </w:tcPr>
+          <w:p>
+            <w:pPr>
+              <w:jc w:val="center"/>
+            </w:pPr>
+            <w:r>
+              <w:rPr>
+                <w:rFonts w:ascii="Calibri" w:hAnsi="Calibri" w:eastAsia="Calibri" w:cs="Calibri"/>
+                <w:sz w:val="21"/>
+                <w:szCs w:val="21"/>
+              </w:rPr>
+              <w:t>-</w:t>
+            </w:r>
+          </w:p>
+        </w:tc>
+      </w:tr>
+      <w:tr>
+        <w:tblPrEx>
+          <w:tblCellMar>
+            <w:top w:w="0" w:type="dxa"/>
+            <w:left w:w="108" w:type="dxa"/>
+            <w:bottom w:w="0" w:type="dxa"/>
+            <w:right w:w="108" w:type="dxa"/>
+          </w:tblCellMar>
+        </w:tblPrEx>
+        <w:trPr>
+          <w:cantSplit/>
+          <w:jc w:val="center"/>
+        </w:trPr>
+        <w:tc>
+          <w:tcPr>
+            <w:tcW w:w="2000" w:type="dxa"/>
+            <w:tcBorders>
+              <w:top w:val="single" w:color="FFFFFF" w:sz="4" w:space="0"/>
+              <w:left w:val="single" w:color="FFFFFF" w:sz="4" w:space="0"/>
+              <w:bottom w:val="single" w:color="FFFFFF" w:sz="4" w:space="0"/>
+              <w:right w:val="single" w:color="FFFFFF" w:sz="4" w:space="0"/>
+            </w:tcBorders>
+            <w:shd w:val="clear" w:color="auto" w:fill="EAF2FB"/>
+            <w:tcMar>
+              <w:top w:w="50" w:type="dxa"/>
+              <w:left w:w="80" w:type="dxa"/>
+              <w:bottom w:w="50" w:type="dxa"/>
+              <w:right w:w="80" w:type="dxa"/>
+            </w:tcMar>
+          </w:tcPr>
+          <w:p>
+            <w:pPr>
+              <w:jc w:val="center"/>
+            </w:pPr>
+            <w:r>
+              <w:rPr>
+                <w:rFonts w:ascii="Calibri" w:hAnsi="Calibri" w:eastAsia="Calibri" w:cs="Calibri"/>
+                <w:sz w:val="21"/>
+                <w:szCs w:val="21"/>
+              </w:rPr>
+              <w:t>T2</w:t>
+            </w:r>
+          </w:p>
+        </w:tc>
+        <w:tc>
+          <w:tcPr>
+            <w:tcW w:w="2200" w:type="dxa"/>
+            <w:tcBorders>
+              <w:top w:val="single" w:color="FFFFFF" w:sz="4" w:space="0"/>
+              <w:left w:val="single" w:color="FFFFFF" w:sz="4" w:space="0"/>
+              <w:bottom w:val="single" w:color="FFFFFF" w:sz="4" w:space="0"/>
+              <w:right w:val="single" w:color="FFFFFF" w:sz="4" w:space="0"/>
+            </w:tcBorders>
+            <w:shd w:val="clear" w:color="auto" w:fill="EAF2FB"/>
+            <w:tcMar>
+              <w:top w:w="50" w:type="dxa"/>
+              <w:left w:w="80" w:type="dxa"/>
+              <w:bottom w:w="50" w:type="dxa"/>
+              <w:right w:w="80" w:type="dxa"/>
+            </w:tcMar>
+          </w:tcPr>
+          <w:p>
+            <w:pPr>
+              <w:jc w:val="center"/>
+            </w:pPr>
+            <w:r>
+              <w:rPr>
+                <w:rFonts w:ascii="Calibri" w:hAnsi="Calibri" w:eastAsia="Calibri" w:cs="Calibri"/>
+                <w:sz w:val="21"/>
+                <w:szCs w:val="21"/>
+              </w:rPr>
+              <w:t>15</w:t>
+            </w:r>
+          </w:p>
+        </w:tc>
+        <w:tc>
+          <w:tcPr>
+            <w:tcW w:w="3000" w:type="dxa"/>
+            <w:tcBorders>
+              <w:top w:val="single" w:color="FFFFFF" w:sz="4" w:space="0"/>
+              <w:left w:val="single" w:color="FFFFFF" w:sz="4" w:space="0"/>
+              <w:bottom w:val="single" w:color="FFFFFF" w:sz="4" w:space="0"/>
+              <w:right w:val="single" w:color="FFFFFF" w:sz="4" w:space="0"/>
+            </w:tcBorders>
+            <w:shd w:val="clear" w:color="auto" w:fill="EAF2FB"/>
+            <w:tcMar>
+              <w:top w:w="50" w:type="dxa"/>
+              <w:left w:w="80" w:type="dxa"/>
+              <w:bottom w:w="50" w:type="dxa"/>
+              <w:right w:w="80" w:type="dxa"/>
+            </w:tcMar>
+          </w:tcPr>
+          <w:p>
+            <w:pPr>
+              <w:jc w:val="center"/>
+            </w:pPr>
+            <w:r>
+              <w:rPr>
+                <w:rFonts w:ascii="Calibri" w:hAnsi="Calibri" w:eastAsia="Calibri" w:cs="Calibri"/>
+                <w:sz w:val="21"/>
+                <w:szCs w:val="21"/>
+              </w:rPr>
+              <w:t>-</w:t>
+            </w:r>
+          </w:p>
+        </w:tc>
+      </w:tr>
+      <w:tr>
+        <w:tblPrEx>
+          <w:tblCellMar>
+            <w:top w:w="0" w:type="dxa"/>
+            <w:left w:w="108" w:type="dxa"/>
+            <w:bottom w:w="0" w:type="dxa"/>
+            <w:right w:w="108" w:type="dxa"/>
+          </w:tblCellMar>
+        </w:tblPrEx>
+        <w:trPr>
+          <w:cantSplit/>
+          <w:jc w:val="center"/>
+        </w:trPr>
+        <w:tc>
+          <w:tcPr>
+            <w:tcW w:w="2000" w:type="dxa"/>
+            <w:tcBorders>
+              <w:top w:val="single" w:color="FFFFFF" w:sz="4" w:space="0"/>
+              <w:left w:val="single" w:color="FFFFFF" w:sz="4" w:space="0"/>
+              <w:bottom w:val="single" w:color="FFFFFF" w:sz="4" w:space="0"/>
+              <w:right w:val="single" w:color="FFFFFF" w:sz="4" w:space="0"/>
+            </w:tcBorders>
+            <w:shd w:val="clear" w:color="auto" w:fill="CFE2F5"/>
+            <w:tcMar>
+              <w:top w:w="50" w:type="dxa"/>
+              <w:left w:w="80" w:type="dxa"/>
+              <w:bottom w:w="50" w:type="dxa"/>
+              <w:right w:w="80" w:type="dxa"/>
+            </w:tcMar>
+          </w:tcPr>
+          <w:p>
+            <w:pPr>
+              <w:jc w:val="center"/>
+            </w:pPr>
+            <w:r>
+              <w:rPr>
+                <w:rFonts w:ascii="Calibri" w:hAnsi="Calibri" w:eastAsia="Calibri" w:cs="Calibri"/>
+                <w:sz w:val="21"/>
+                <w:szCs w:val="21"/>
+              </w:rPr>
+              <w:t>T3</w:t>
+            </w:r>
+          </w:p>
+        </w:tc>
+        <w:tc>
+          <w:tcPr>
+            <w:tcW w:w="2200" w:type="dxa"/>
+            <w:tcBorders>
+              <w:top w:val="single" w:color="FFFFFF" w:sz="4" w:space="0"/>
+              <w:left w:val="single" w:color="FFFFFF" w:sz="4" w:space="0"/>
+              <w:bottom w:val="single" w:color="FFFFFF" w:sz="4" w:space="0"/>
+              <w:right w:val="single" w:color="FFFFFF" w:sz="4" w:space="0"/>
+            </w:tcBorders>
+            <w:shd w:val="clear" w:color="auto" w:fill="CFE2F5"/>
+            <w:tcMar>
+              <w:top w:w="50" w:type="dxa"/>
+              <w:left w:w="80" w:type="dxa"/>
+              <w:bottom w:w="50" w:type="dxa"/>
+              <w:right w:w="80" w:type="dxa"/>
+            </w:tcMar>
+          </w:tcPr>
+          <w:p>
+            <w:pPr>
+              <w:jc w:val="center"/>
+            </w:pPr>
+            <w:r>
+              <w:rPr>
+                <w:rFonts w:ascii="Calibri" w:hAnsi="Calibri" w:eastAsia="Calibri" w:cs="Calibri"/>
+                <w:sz w:val="21"/>
+                <w:szCs w:val="21"/>
+              </w:rPr>
+              <w:t>15</w:t>
+            </w:r>
+          </w:p>
+        </w:tc>
+        <w:tc>
+          <w:tcPr>
+            <w:tcW w:w="3000" w:type="dxa"/>
+            <w:tcBorders>
+              <w:top w:val="single" w:color="FFFFFF" w:sz="4" w:space="0"/>
+              <w:left w:val="single" w:color="FFFFFF" w:sz="4" w:space="0"/>
+              <w:bottom w:val="single" w:color="FFFFFF" w:sz="4" w:space="0"/>
+              <w:right w:val="single" w:color="FFFFFF" w:sz="4" w:space="0"/>
+            </w:tcBorders>
+            <w:shd w:val="clear" w:color="auto" w:fill="CFE2F5"/>
+            <w:tcMar>
+              <w:top w:w="50" w:type="dxa"/>
+              <w:left w:w="80" w:type="dxa"/>
+              <w:bottom w:w="50" w:type="dxa"/>
+              <w:right w:w="80" w:type="dxa"/>
+            </w:tcMar>
+          </w:tcPr>
+          <w:p>
+            <w:pPr>
+              <w:jc w:val="center"/>
+            </w:pPr>
+            <w:r>
+              <w:rPr>
+                <w:rFonts w:ascii="Calibri" w:hAnsi="Calibri" w:eastAsia="Calibri" w:cs="Calibri"/>
+                <w:sz w:val="21"/>
+                <w:szCs w:val="21"/>
+              </w:rPr>
+              <w:t>T1</w:t>
+            </w:r>
+          </w:p>
+        </w:tc>
+      </w:tr>
+      <w:tr>
+        <w:tblPrEx>
+          <w:tblCellMar>
+            <w:top w:w="0" w:type="dxa"/>
+            <w:left w:w="108" w:type="dxa"/>
+            <w:bottom w:w="0" w:type="dxa"/>
+            <w:right w:w="108" w:type="dxa"/>
+          </w:tblCellMar>
+        </w:tblPrEx>
+        <w:trPr>
+          <w:cantSplit/>
+          <w:jc w:val="center"/>
+        </w:trPr>
+        <w:tc>
+          <w:tcPr>
+            <w:tcW w:w="2000" w:type="dxa"/>
+            <w:tcBorders>
+              <w:top w:val="single" w:color="FFFFFF" w:sz="4" w:space="0"/>
+              <w:left w:val="single" w:color="FFFFFF" w:sz="4" w:space="0"/>
+              <w:bottom w:val="single" w:color="FFFFFF" w:sz="4" w:space="0"/>
+              <w:right w:val="single" w:color="FFFFFF" w:sz="4" w:space="0"/>
+            </w:tcBorders>
+            <w:shd w:val="clear" w:color="auto" w:fill="EAF2FB"/>
+            <w:tcMar>
+              <w:top w:w="50" w:type="dxa"/>
+              <w:left w:w="80" w:type="dxa"/>
+              <w:bottom w:w="50" w:type="dxa"/>
+              <w:right w:w="80" w:type="dxa"/>
+            </w:tcMar>
+          </w:tcPr>
+          <w:p>
+            <w:pPr>
+              <w:jc w:val="center"/>
+            </w:pPr>
+            <w:r>
+              <w:rPr>
+                <w:rFonts w:ascii="Calibri" w:hAnsi="Calibri" w:eastAsia="Calibri" w:cs="Calibri"/>
+                <w:sz w:val="21"/>
+                <w:szCs w:val="21"/>
+              </w:rPr>
+              <w:t>T4</w:t>
+            </w:r>
+          </w:p>
+        </w:tc>
+        <w:tc>
+          <w:tcPr>
+            <w:tcW w:w="2200" w:type="dxa"/>
+            <w:tcBorders>
+              <w:top w:val="single" w:color="FFFFFF" w:sz="4" w:space="0"/>
+              <w:left w:val="single" w:color="FFFFFF" w:sz="4" w:space="0"/>
+              <w:bottom w:val="single" w:color="FFFFFF" w:sz="4" w:space="0"/>
+              <w:right w:val="single" w:color="FFFFFF" w:sz="4" w:space="0"/>
+            </w:tcBorders>
+            <w:shd w:val="clear" w:color="auto" w:fill="EAF2FB"/>
+            <w:tcMar>
+              <w:top w:w="50" w:type="dxa"/>
+              <w:left w:w="80" w:type="dxa"/>
+              <w:bottom w:w="50" w:type="dxa"/>
+              <w:right w:w="80" w:type="dxa"/>
+            </w:tcMar>
+          </w:tcPr>
+          <w:p>
+            <w:pPr>
+              <w:jc w:val="center"/>
+            </w:pPr>
+            <w:r>
+              <w:rPr>
+                <w:rFonts w:ascii="Calibri" w:hAnsi="Calibri" w:eastAsia="Calibri" w:cs="Calibri"/>
+                <w:sz w:val="21"/>
+                <w:szCs w:val="21"/>
+              </w:rPr>
+              <w:t>10</w:t>
+            </w:r>
+          </w:p>
+        </w:tc>
+        <w:tc>
+          <w:tcPr>
+            <w:tcW w:w="3000" w:type="dxa"/>
+            <w:tcBorders>
+              <w:top w:val="single" w:color="FFFFFF" w:sz="4" w:space="0"/>
+              <w:left w:val="single" w:color="FFFFFF" w:sz="4" w:space="0"/>
+              <w:bottom w:val="single" w:color="FFFFFF" w:sz="4" w:space="0"/>
+              <w:right w:val="single" w:color="FFFFFF" w:sz="4" w:space="0"/>
+            </w:tcBorders>
+            <w:shd w:val="clear" w:color="auto" w:fill="EAF2FB"/>
+            <w:tcMar>
+              <w:top w:w="50" w:type="dxa"/>
+              <w:left w:w="80" w:type="dxa"/>
+              <w:bottom w:w="50" w:type="dxa"/>
+              <w:right w:w="80" w:type="dxa"/>
+            </w:tcMar>
+          </w:tcPr>
+          <w:p>
+            <w:pPr>
+              <w:jc w:val="center"/>
+            </w:pPr>
+            <w:r>
+              <w:rPr>
+                <w:rFonts w:ascii="Calibri" w:hAnsi="Calibri" w:eastAsia="Calibri" w:cs="Calibri"/>
+                <w:sz w:val="21"/>
+                <w:szCs w:val="21"/>
+              </w:rPr>
+              <w:t>-</w:t>
+            </w:r>
+          </w:p>
+        </w:tc>
+      </w:tr>
+      <w:tr>
+        <w:tblPrEx>
+          <w:tblCellMar>
+            <w:top w:w="0" w:type="dxa"/>
+            <w:left w:w="108" w:type="dxa"/>
+            <w:bottom w:w="0" w:type="dxa"/>
+            <w:right w:w="108" w:type="dxa"/>
+          </w:tblCellMar>
+        </w:tblPrEx>
+        <w:trPr>
+          <w:cantSplit/>
+          <w:jc w:val="center"/>
+        </w:trPr>
+        <w:tc>
+          <w:tcPr>
+            <w:tcW w:w="2000" w:type="dxa"/>
+            <w:tcBorders>
+              <w:top w:val="single" w:color="FFFFFF" w:sz="4" w:space="0"/>
+              <w:left w:val="single" w:color="FFFFFF" w:sz="4" w:space="0"/>
+              <w:bottom w:val="single" w:color="FFFFFF" w:sz="4" w:space="0"/>
+              <w:right w:val="single" w:color="FFFFFF" w:sz="4" w:space="0"/>
+            </w:tcBorders>
+            <w:shd w:val="clear" w:color="auto" w:fill="CFE2F5"/>
+            <w:tcMar>
+              <w:top w:w="50" w:type="dxa"/>
+              <w:left w:w="80" w:type="dxa"/>
+              <w:bottom w:w="50" w:type="dxa"/>
+              <w:right w:w="80" w:type="dxa"/>
+            </w:tcMar>
+          </w:tcPr>
+          <w:p>
+            <w:pPr>
+              <w:jc w:val="center"/>
+            </w:pPr>
+            <w:r>
+              <w:rPr>
+                <w:rFonts w:ascii="Calibri" w:hAnsi="Calibri" w:eastAsia="Calibri" w:cs="Calibri"/>
+                <w:sz w:val="21"/>
+                <w:szCs w:val="21"/>
+              </w:rPr>
+              <w:t>T5</w:t>
+            </w:r>
+          </w:p>
+        </w:tc>
+        <w:tc>
+          <w:tcPr>
+            <w:tcW w:w="2200" w:type="dxa"/>
+            <w:tcBorders>
+              <w:top w:val="single" w:color="FFFFFF" w:sz="4" w:space="0"/>
+              <w:left w:val="single" w:color="FFFFFF" w:sz="4" w:space="0"/>
+              <w:bottom w:val="single" w:color="FFFFFF" w:sz="4" w:space="0"/>
+              <w:right w:val="single" w:color="FFFFFF" w:sz="4" w:space="0"/>
+            </w:tcBorders>
+            <w:shd w:val="clear" w:color="auto" w:fill="CFE2F5"/>
+            <w:tcMar>
+              <w:top w:w="50" w:type="dxa"/>
+              <w:left w:w="80" w:type="dxa"/>
+              <w:bottom w:w="50" w:type="dxa"/>
+              <w:right w:w="80" w:type="dxa"/>
+            </w:tcMar>
+          </w:tcPr>
+          <w:p>
+            <w:pPr>
+              <w:jc w:val="center"/>
+            </w:pPr>
+            <w:r>
+              <w:rPr>
+                <w:rFonts w:ascii="Calibri" w:hAnsi="Calibri" w:eastAsia="Calibri" w:cs="Calibri"/>
+                <w:sz w:val="21"/>
+                <w:szCs w:val="21"/>
+              </w:rPr>
+              <w:t>10</w:t>
+            </w:r>
+          </w:p>
+        </w:tc>
+        <w:tc>
+          <w:tcPr>
+            <w:tcW w:w="3000" w:type="dxa"/>
+            <w:tcBorders>
+              <w:top w:val="single" w:color="FFFFFF" w:sz="4" w:space="0"/>
+              <w:left w:val="single" w:color="FFFFFF" w:sz="4" w:space="0"/>
+              <w:bottom w:val="single" w:color="FFFFFF" w:sz="4" w:space="0"/>
+              <w:right w:val="single" w:color="FFFFFF" w:sz="4" w:space="0"/>
+            </w:tcBorders>
+            <w:shd w:val="clear" w:color="auto" w:fill="CFE2F5"/>
+            <w:tcMar>
+              <w:top w:w="50" w:type="dxa"/>
+              <w:left w:w="80" w:type="dxa"/>
+              <w:bottom w:w="50" w:type="dxa"/>
+              <w:right w:w="80" w:type="dxa"/>
+            </w:tcMar>
+          </w:tcPr>
+          <w:p>
+            <w:pPr>
+              <w:jc w:val="center"/>
+            </w:pPr>
+            <w:r>
+              <w:rPr>
+                <w:rFonts w:ascii="Calibri" w:hAnsi="Calibri" w:eastAsia="Calibri" w:cs="Calibri"/>
+                <w:sz w:val="21"/>
+                <w:szCs w:val="21"/>
+              </w:rPr>
+              <w:t>T2, T4</w:t>
+            </w:r>
+          </w:p>
+        </w:tc>
+      </w:tr>
+      <w:tr>
+        <w:tblPrEx>
+          <w:tblCellMar>
+            <w:top w:w="0" w:type="dxa"/>
+            <w:left w:w="108" w:type="dxa"/>
+            <w:bottom w:w="0" w:type="dxa"/>
+            <w:right w:w="108" w:type="dxa"/>
+          </w:tblCellMar>
+        </w:tblPrEx>
+        <w:trPr>
+          <w:cantSplit/>
+          <w:jc w:val="center"/>
+        </w:trPr>
+        <w:tc>
+          <w:tcPr>
+            <w:tcW w:w="2000" w:type="dxa"/>
+            <w:tcBorders>
+              <w:top w:val="single" w:color="FFFFFF" w:sz="4" w:space="0"/>
+              <w:left w:val="single" w:color="FFFFFF" w:sz="4" w:space="0"/>
+              <w:bottom w:val="single" w:color="FFFFFF" w:sz="4" w:space="0"/>
+              <w:right w:val="single" w:color="FFFFFF" w:sz="4" w:space="0"/>
+            </w:tcBorders>
+            <w:shd w:val="clear" w:color="auto" w:fill="EAF2FB"/>
+            <w:tcMar>
+              <w:top w:w="50" w:type="dxa"/>
+              <w:left w:w="80" w:type="dxa"/>
+              <w:bottom w:w="50" w:type="dxa"/>
+              <w:right w:w="80" w:type="dxa"/>
+            </w:tcMar>
+          </w:tcPr>
+          <w:p>
+            <w:pPr>
+              <w:jc w:val="center"/>
+            </w:pPr>
+            <w:r>
+              <w:rPr>
+                <w:rFonts w:ascii="Calibri" w:hAnsi="Calibri" w:eastAsia="Calibri" w:cs="Calibri"/>
+                <w:sz w:val="21"/>
+                <w:szCs w:val="21"/>
+              </w:rPr>
+              <w:t>T6</w:t>
+            </w:r>
+          </w:p>
+        </w:tc>
+        <w:tc>
+          <w:tcPr>
+            <w:tcW w:w="2200" w:type="dxa"/>
+            <w:tcBorders>
+              <w:top w:val="single" w:color="FFFFFF" w:sz="4" w:space="0"/>
+              <w:left w:val="single" w:color="FFFFFF" w:sz="4" w:space="0"/>
+              <w:bottom w:val="single" w:color="FFFFFF" w:sz="4" w:space="0"/>
+              <w:right w:val="single" w:color="FFFFFF" w:sz="4" w:space="0"/>
+            </w:tcBorders>
+            <w:shd w:val="clear" w:color="auto" w:fill="EAF2FB"/>
+            <w:tcMar>
+              <w:top w:w="50" w:type="dxa"/>
+              <w:left w:w="80" w:type="dxa"/>
+              <w:bottom w:w="50" w:type="dxa"/>
+              <w:right w:w="80" w:type="dxa"/>
+            </w:tcMar>
+          </w:tcPr>
+          <w:p>
+            <w:pPr>
+              <w:jc w:val="center"/>
+            </w:pPr>
+            <w:r>
+              <w:rPr>
+                <w:rFonts w:ascii="Calibri" w:hAnsi="Calibri" w:eastAsia="Calibri" w:cs="Calibri"/>
+                <w:sz w:val="21"/>
+                <w:szCs w:val="21"/>
+              </w:rPr>
+              <w:t>5</w:t>
+            </w:r>
+          </w:p>
+        </w:tc>
+        <w:tc>
+          <w:tcPr>
+            <w:tcW w:w="3000" w:type="dxa"/>
+            <w:tcBorders>
+              <w:top w:val="single" w:color="FFFFFF" w:sz="4" w:space="0"/>
+              <w:left w:val="single" w:color="FFFFFF" w:sz="4" w:space="0"/>
+              <w:bottom w:val="single" w:color="FFFFFF" w:sz="4" w:space="0"/>
+              <w:right w:val="single" w:color="FFFFFF" w:sz="4" w:space="0"/>
+            </w:tcBorders>
+            <w:shd w:val="clear" w:color="auto" w:fill="EAF2FB"/>
+            <w:tcMar>
+              <w:top w:w="50" w:type="dxa"/>
+              <w:left w:w="80" w:type="dxa"/>
+              <w:bottom w:w="50" w:type="dxa"/>
+              <w:right w:w="80" w:type="dxa"/>
+            </w:tcMar>
+          </w:tcPr>
+          <w:p>
+            <w:pPr>
+              <w:jc w:val="center"/>
+            </w:pPr>
+            <w:r>
+              <w:rPr>
+                <w:rFonts w:ascii="Calibri" w:hAnsi="Calibri" w:eastAsia="Calibri" w:cs="Calibri"/>
+                <w:sz w:val="21"/>
+                <w:szCs w:val="21"/>
+              </w:rPr>
+              <w:t>T1, T2</w:t>
+            </w:r>
+          </w:p>
+        </w:tc>
+      </w:tr>
+      <w:tr>
+        <w:tblPrEx>
+          <w:tblCellMar>
+            <w:top w:w="0" w:type="dxa"/>
+            <w:left w:w="108" w:type="dxa"/>
+            <w:bottom w:w="0" w:type="dxa"/>
+            <w:right w:w="108" w:type="dxa"/>
+          </w:tblCellMar>
+        </w:tblPrEx>
+        <w:trPr>
+          <w:cantSplit/>
+          <w:jc w:val="center"/>
+        </w:trPr>
+        <w:tc>
+          <w:tcPr>
+            <w:tcW w:w="2000" w:type="dxa"/>
+            <w:tcBorders>
+              <w:top w:val="single" w:color="FFFFFF" w:sz="4" w:space="0"/>
+              <w:left w:val="single" w:color="FFFFFF" w:sz="4" w:space="0"/>
+              <w:bottom w:val="single" w:color="FFFFFF" w:sz="4" w:space="0"/>
+              <w:right w:val="single" w:color="FFFFFF" w:sz="4" w:space="0"/>
+            </w:tcBorders>
+            <w:shd w:val="clear" w:color="auto" w:fill="CFE2F5"/>
+            <w:tcMar>
+              <w:top w:w="50" w:type="dxa"/>
+              <w:left w:w="80" w:type="dxa"/>
+              <w:bottom w:w="50" w:type="dxa"/>
+              <w:right w:w="80" w:type="dxa"/>
+            </w:tcMar>
+          </w:tcPr>
+          <w:p>
+            <w:pPr>
+              <w:jc w:val="center"/>
+            </w:pPr>
+            <w:r>
+              <w:rPr>
+                <w:rFonts w:ascii="Calibri" w:hAnsi="Calibri" w:eastAsia="Calibri" w:cs="Calibri"/>
+                <w:sz w:val="21"/>
+                <w:szCs w:val="21"/>
+              </w:rPr>
+              <w:t>T7</w:t>
+            </w:r>
+          </w:p>
+        </w:tc>
+        <w:tc>
+          <w:tcPr>
+            <w:tcW w:w="2200" w:type="dxa"/>
+            <w:tcBorders>
+              <w:top w:val="single" w:color="FFFFFF" w:sz="4" w:space="0"/>
+              <w:left w:val="single" w:color="FFFFFF" w:sz="4" w:space="0"/>
+              <w:bottom w:val="single" w:color="FFFFFF" w:sz="4" w:space="0"/>
+              <w:right w:val="single" w:color="FFFFFF" w:sz="4" w:space="0"/>
+            </w:tcBorders>
+            <w:shd w:val="clear" w:color="auto" w:fill="CFE2F5"/>
+            <w:tcMar>
+              <w:top w:w="50" w:type="dxa"/>
+              <w:left w:w="80" w:type="dxa"/>
+              <w:bottom w:w="50" w:type="dxa"/>
+              <w:right w:w="80" w:type="dxa"/>
+            </w:tcMar>
+          </w:tcPr>
+          <w:p>
+            <w:pPr>
+              <w:jc w:val="center"/>
+            </w:pPr>
+            <w:r>
+              <w:rPr>
+                <w:rFonts w:ascii="Calibri" w:hAnsi="Calibri" w:eastAsia="Calibri" w:cs="Calibri"/>
+                <w:sz w:val="21"/>
+                <w:szCs w:val="21"/>
+              </w:rPr>
+              <w:t>20</w:t>
+            </w:r>
+          </w:p>
+        </w:tc>
+        <w:tc>
+          <w:tcPr>
+            <w:tcW w:w="3000" w:type="dxa"/>
+            <w:tcBorders>
+              <w:top w:val="single" w:color="FFFFFF" w:sz="4" w:space="0"/>
+              <w:left w:val="single" w:color="FFFFFF" w:sz="4" w:space="0"/>
+              <w:bottom w:val="single" w:color="FFFFFF" w:sz="4" w:space="0"/>
+              <w:right w:val="single" w:color="FFFFFF" w:sz="4" w:space="0"/>
+            </w:tcBorders>
+            <w:shd w:val="clear" w:color="auto" w:fill="CFE2F5"/>
+            <w:tcMar>
+              <w:top w:w="50" w:type="dxa"/>
+              <w:left w:w="80" w:type="dxa"/>
+              <w:bottom w:w="50" w:type="dxa"/>
+              <w:right w:w="80" w:type="dxa"/>
+            </w:tcMar>
+          </w:tcPr>
+          <w:p>
+            <w:pPr>
+              <w:jc w:val="center"/>
+            </w:pPr>
+            <w:r>
+              <w:rPr>
+                <w:rFonts w:ascii="Calibri" w:hAnsi="Calibri" w:eastAsia="Calibri" w:cs="Calibri"/>
+                <w:sz w:val="21"/>
+                <w:szCs w:val="21"/>
+              </w:rPr>
+              <w:t>T1</w:t>
+            </w:r>
+          </w:p>
+        </w:tc>
+      </w:tr>
+      <w:tr>
+        <w:tblPrEx>
+          <w:tblCellMar>
+            <w:top w:w="0" w:type="dxa"/>
+            <w:left w:w="108" w:type="dxa"/>
+            <w:bottom w:w="0" w:type="dxa"/>
+            <w:right w:w="108" w:type="dxa"/>
+          </w:tblCellMar>
+        </w:tblPrEx>
+        <w:trPr>
+          <w:cantSplit/>
+          <w:jc w:val="center"/>
+        </w:trPr>
+        <w:tc>
+          <w:tcPr>
+            <w:tcW w:w="2000" w:type="dxa"/>
+            <w:tcBorders>
+              <w:top w:val="single" w:color="FFFFFF" w:sz="4" w:space="0"/>
+              <w:left w:val="single" w:color="FFFFFF" w:sz="4" w:space="0"/>
+              <w:bottom w:val="single" w:color="FFFFFF" w:sz="4" w:space="0"/>
+              <w:right w:val="single" w:color="FFFFFF" w:sz="4" w:space="0"/>
+            </w:tcBorders>
+            <w:shd w:val="clear" w:color="auto" w:fill="EAF2FB"/>
+            <w:tcMar>
+              <w:top w:w="50" w:type="dxa"/>
+              <w:left w:w="80" w:type="dxa"/>
+              <w:bottom w:w="50" w:type="dxa"/>
+              <w:right w:w="80" w:type="dxa"/>
+            </w:tcMar>
+          </w:tcPr>
+          <w:p>
+            <w:pPr>
+              <w:jc w:val="center"/>
+            </w:pPr>
+            <w:r>
+              <w:rPr>
+                <w:rFonts w:ascii="Calibri" w:hAnsi="Calibri" w:eastAsia="Calibri" w:cs="Calibri"/>
+                <w:sz w:val="21"/>
+                <w:szCs w:val="21"/>
+              </w:rPr>
+              <w:t>T8</w:t>
+            </w:r>
+          </w:p>
+        </w:tc>
+        <w:tc>
+          <w:tcPr>
+            <w:tcW w:w="2200" w:type="dxa"/>
+            <w:tcBorders>
+              <w:top w:val="single" w:color="FFFFFF" w:sz="4" w:space="0"/>
+              <w:left w:val="single" w:color="FFFFFF" w:sz="4" w:space="0"/>
+              <w:bottom w:val="single" w:color="FFFFFF" w:sz="4" w:space="0"/>
+              <w:right w:val="single" w:color="FFFFFF" w:sz="4" w:space="0"/>
+            </w:tcBorders>
+            <w:shd w:val="clear" w:color="auto" w:fill="EAF2FB"/>
+            <w:tcMar>
+              <w:top w:w="50" w:type="dxa"/>
+              <w:left w:w="80" w:type="dxa"/>
+              <w:bottom w:w="50" w:type="dxa"/>
+              <w:right w:w="80" w:type="dxa"/>
+            </w:tcMar>
+          </w:tcPr>
+          <w:p>
+            <w:pPr>
+              <w:jc w:val="center"/>
+            </w:pPr>
+            <w:r>
+              <w:rPr>
+                <w:rFonts w:ascii="Calibri" w:hAnsi="Calibri" w:eastAsia="Calibri" w:cs="Calibri"/>
+                <w:sz w:val="21"/>
+                <w:szCs w:val="21"/>
+              </w:rPr>
+              <w:t>25</w:t>
+            </w:r>
+          </w:p>
+        </w:tc>
+        <w:tc>
+          <w:tcPr>
+            <w:tcW w:w="3000" w:type="dxa"/>
+            <w:tcBorders>
+              <w:top w:val="single" w:color="FFFFFF" w:sz="4" w:space="0"/>
+              <w:left w:val="single" w:color="FFFFFF" w:sz="4" w:space="0"/>
+              <w:bottom w:val="single" w:color="FFFFFF" w:sz="4" w:space="0"/>
+              <w:right w:val="single" w:color="FFFFFF" w:sz="4" w:space="0"/>
+            </w:tcBorders>
+            <w:shd w:val="clear" w:color="auto" w:fill="EAF2FB"/>
+            <w:tcMar>
+              <w:top w:w="50" w:type="dxa"/>
+              <w:left w:w="80" w:type="dxa"/>
+              <w:bottom w:w="50" w:type="dxa"/>
+              <w:right w:w="80" w:type="dxa"/>
+            </w:tcMar>
+          </w:tcPr>
+          <w:p>
+            <w:pPr>
+              <w:jc w:val="center"/>
+            </w:pPr>
+            <w:r>
+              <w:rPr>
+                <w:rFonts w:ascii="Calibri" w:hAnsi="Calibri" w:eastAsia="Calibri" w:cs="Calibri"/>
+                <w:sz w:val="21"/>
+                <w:szCs w:val="21"/>
+              </w:rPr>
+              <w:t>T4</w:t>
+            </w:r>
+          </w:p>
+        </w:tc>
+      </w:tr>
+      <w:tr>
+        <w:tblPrEx>
+          <w:tblCellMar>
+            <w:top w:w="0" w:type="dxa"/>
+            <w:left w:w="108" w:type="dxa"/>
+            <w:bottom w:w="0" w:type="dxa"/>
+            <w:right w:w="108" w:type="dxa"/>
+          </w:tblCellMar>
+        </w:tblPrEx>
+        <w:trPr>
+          <w:cantSplit/>
+          <w:jc w:val="center"/>
+        </w:trPr>
+        <w:tc>
+          <w:tcPr>
+            <w:tcW w:w="2000" w:type="dxa"/>
+            <w:tcBorders>
+              <w:top w:val="single" w:color="FFFFFF" w:sz="4" w:space="0"/>
+              <w:left w:val="single" w:color="FFFFFF" w:sz="4" w:space="0"/>
+              <w:bottom w:val="single" w:color="FFFFFF" w:sz="4" w:space="0"/>
+              <w:right w:val="single" w:color="FFFFFF" w:sz="4" w:space="0"/>
+            </w:tcBorders>
+            <w:shd w:val="clear" w:color="auto" w:fill="CFE2F5"/>
+            <w:tcMar>
+              <w:top w:w="50" w:type="dxa"/>
+              <w:left w:w="80" w:type="dxa"/>
+              <w:bottom w:w="50" w:type="dxa"/>
+              <w:right w:w="80" w:type="dxa"/>
+            </w:tcMar>
+          </w:tcPr>
+          <w:p>
+            <w:pPr>
+              <w:jc w:val="center"/>
+            </w:pPr>
+            <w:r>
+              <w:rPr>
+                <w:rFonts w:ascii="Calibri" w:hAnsi="Calibri" w:eastAsia="Calibri" w:cs="Calibri"/>
+                <w:sz w:val="21"/>
+                <w:szCs w:val="21"/>
+              </w:rPr>
+              <w:t>T9</w:t>
+            </w:r>
+          </w:p>
+        </w:tc>
+        <w:tc>
+          <w:tcPr>
+            <w:tcW w:w="2200" w:type="dxa"/>
+            <w:tcBorders>
+              <w:top w:val="single" w:color="FFFFFF" w:sz="4" w:space="0"/>
+              <w:left w:val="single" w:color="FFFFFF" w:sz="4" w:space="0"/>
+              <w:bottom w:val="single" w:color="FFFFFF" w:sz="4" w:space="0"/>
+              <w:right w:val="single" w:color="FFFFFF" w:sz="4" w:space="0"/>
+            </w:tcBorders>
+            <w:shd w:val="clear" w:color="auto" w:fill="CFE2F5"/>
+            <w:tcMar>
+              <w:top w:w="50" w:type="dxa"/>
+              <w:left w:w="80" w:type="dxa"/>
+              <w:bottom w:w="50" w:type="dxa"/>
+              <w:right w:w="80" w:type="dxa"/>
+            </w:tcMar>
+          </w:tcPr>
+          <w:p>
+            <w:pPr>
+              <w:jc w:val="center"/>
+            </w:pPr>
+            <w:r>
+              <w:rPr>
+                <w:rFonts w:ascii="Calibri" w:hAnsi="Calibri" w:eastAsia="Calibri" w:cs="Calibri"/>
+                <w:sz w:val="21"/>
+                <w:szCs w:val="21"/>
+              </w:rPr>
+              <w:t>15</w:t>
+            </w:r>
+          </w:p>
+        </w:tc>
+        <w:tc>
+          <w:tcPr>
+            <w:tcW w:w="3000" w:type="dxa"/>
+            <w:tcBorders>
+              <w:top w:val="single" w:color="FFFFFF" w:sz="4" w:space="0"/>
+              <w:left w:val="single" w:color="FFFFFF" w:sz="4" w:space="0"/>
+              <w:bottom w:val="single" w:color="FFFFFF" w:sz="4" w:space="0"/>
+              <w:right w:val="single" w:color="FFFFFF" w:sz="4" w:space="0"/>
+            </w:tcBorders>
+            <w:shd w:val="clear" w:color="auto" w:fill="CFE2F5"/>
+            <w:tcMar>
+              <w:top w:w="50" w:type="dxa"/>
+              <w:left w:w="80" w:type="dxa"/>
+              <w:bottom w:w="50" w:type="dxa"/>
+              <w:right w:w="80" w:type="dxa"/>
+            </w:tcMar>
+          </w:tcPr>
+          <w:p>
+            <w:pPr>
+              <w:jc w:val="center"/>
+            </w:pPr>
+            <w:r>
+              <w:rPr>
+                <w:rFonts w:ascii="Calibri" w:hAnsi="Calibri" w:eastAsia="Calibri" w:cs="Calibri"/>
+                <w:sz w:val="21"/>
+                <w:szCs w:val="21"/>
+              </w:rPr>
+              <w:t>T3, T6</w:t>
+            </w:r>
+          </w:p>
+        </w:tc>
+      </w:tr>
+      <w:tr>
+        <w:tblPrEx>
+          <w:tblCellMar>
+            <w:top w:w="0" w:type="dxa"/>
+            <w:left w:w="108" w:type="dxa"/>
+            <w:bottom w:w="0" w:type="dxa"/>
+            <w:right w:w="108" w:type="dxa"/>
+          </w:tblCellMar>
+        </w:tblPrEx>
+        <w:trPr>
+          <w:cantSplit/>
+          <w:jc w:val="center"/>
+        </w:trPr>
+        <w:tc>
+          <w:tcPr>
+            <w:tcW w:w="2000" w:type="dxa"/>
+            <w:tcBorders>
+              <w:top w:val="single" w:color="FFFFFF" w:sz="4" w:space="0"/>
+              <w:left w:val="single" w:color="FFFFFF" w:sz="4" w:space="0"/>
+              <w:bottom w:val="single" w:color="FFFFFF" w:sz="4" w:space="0"/>
+              <w:right w:val="single" w:color="FFFFFF" w:sz="4" w:space="0"/>
+            </w:tcBorders>
+            <w:shd w:val="clear" w:color="auto" w:fill="EAF2FB"/>
+            <w:tcMar>
+              <w:top w:w="50" w:type="dxa"/>
+              <w:left w:w="80" w:type="dxa"/>
+              <w:bottom w:w="50" w:type="dxa"/>
+              <w:right w:w="80" w:type="dxa"/>
+            </w:tcMar>
+          </w:tcPr>
+          <w:p>
+            <w:pPr>
+              <w:jc w:val="center"/>
+            </w:pPr>
+            <w:r>
+              <w:rPr>
+                <w:rFonts w:ascii="Calibri" w:hAnsi="Calibri" w:eastAsia="Calibri" w:cs="Calibri"/>
+                <w:sz w:val="21"/>
+                <w:szCs w:val="21"/>
+              </w:rPr>
+              <w:t>T10</w:t>
+            </w:r>
+          </w:p>
+        </w:tc>
+        <w:tc>
+          <w:tcPr>
+            <w:tcW w:w="2200" w:type="dxa"/>
+            <w:tcBorders>
+              <w:top w:val="single" w:color="FFFFFF" w:sz="4" w:space="0"/>
+              <w:left w:val="single" w:color="FFFFFF" w:sz="4" w:space="0"/>
+              <w:bottom w:val="single" w:color="FFFFFF" w:sz="4" w:space="0"/>
+              <w:right w:val="single" w:color="FFFFFF" w:sz="4" w:space="0"/>
+            </w:tcBorders>
+            <w:shd w:val="clear" w:color="auto" w:fill="EAF2FB"/>
+            <w:tcMar>
+              <w:top w:w="50" w:type="dxa"/>
+              <w:left w:w="80" w:type="dxa"/>
+              <w:bottom w:w="50" w:type="dxa"/>
+              <w:right w:w="80" w:type="dxa"/>
+            </w:tcMar>
+          </w:tcPr>
+          <w:p>
+            <w:pPr>
+              <w:jc w:val="center"/>
+            </w:pPr>
+            <w:r>
+              <w:rPr>
+                <w:rFonts w:ascii="Calibri" w:hAnsi="Calibri" w:eastAsia="Calibri" w:cs="Calibri"/>
+                <w:sz w:val="21"/>
+                <w:szCs w:val="21"/>
+              </w:rPr>
+              <w:t>15</w:t>
+            </w:r>
+          </w:p>
+        </w:tc>
+        <w:tc>
+          <w:tcPr>
+            <w:tcW w:w="3000" w:type="dxa"/>
+            <w:tcBorders>
+              <w:top w:val="single" w:color="FFFFFF" w:sz="4" w:space="0"/>
+              <w:left w:val="single" w:color="FFFFFF" w:sz="4" w:space="0"/>
+              <w:bottom w:val="single" w:color="FFFFFF" w:sz="4" w:space="0"/>
+              <w:right w:val="single" w:color="FFFFFF" w:sz="4" w:space="0"/>
+            </w:tcBorders>
+            <w:shd w:val="clear" w:color="auto" w:fill="EAF2FB"/>
+            <w:tcMar>
+              <w:top w:w="50" w:type="dxa"/>
+              <w:left w:w="80" w:type="dxa"/>
+              <w:bottom w:w="50" w:type="dxa"/>
+              <w:right w:w="80" w:type="dxa"/>
+            </w:tcMar>
+          </w:tcPr>
+          <w:p>
+            <w:pPr>
+              <w:jc w:val="center"/>
+            </w:pPr>
+            <w:r>
+              <w:rPr>
+                <w:rFonts w:ascii="Calibri" w:hAnsi="Calibri" w:eastAsia="Calibri" w:cs="Calibri"/>
+                <w:sz w:val="21"/>
+                <w:szCs w:val="21"/>
+              </w:rPr>
+              <w:t>T5, T7</w:t>
+            </w:r>
+          </w:p>
+        </w:tc>
+      </w:tr>
+      <w:tr>
+        <w:tblPrEx>
+          <w:tblCellMar>
+            <w:top w:w="0" w:type="dxa"/>
+            <w:left w:w="108" w:type="dxa"/>
+            <w:bottom w:w="0" w:type="dxa"/>
+            <w:right w:w="108" w:type="dxa"/>
+          </w:tblCellMar>
+        </w:tblPrEx>
+        <w:trPr>
+          <w:cantSplit/>
+          <w:jc w:val="center"/>
+        </w:trPr>
+        <w:tc>
+          <w:tcPr>
+            <w:tcW w:w="2000" w:type="dxa"/>
+            <w:tcBorders>
+              <w:top w:val="single" w:color="FFFFFF" w:sz="4" w:space="0"/>
+              <w:left w:val="single" w:color="FFFFFF" w:sz="4" w:space="0"/>
+              <w:bottom w:val="single" w:color="FFFFFF" w:sz="4" w:space="0"/>
+              <w:right w:val="single" w:color="FFFFFF" w:sz="4" w:space="0"/>
+            </w:tcBorders>
+            <w:shd w:val="clear" w:color="auto" w:fill="CFE2F5"/>
+            <w:tcMar>
+              <w:top w:w="50" w:type="dxa"/>
+              <w:left w:w="80" w:type="dxa"/>
+              <w:bottom w:w="50" w:type="dxa"/>
+              <w:right w:w="80" w:type="dxa"/>
+            </w:tcMar>
+          </w:tcPr>
+          <w:p>
+            <w:pPr>
+              <w:jc w:val="center"/>
+            </w:pPr>
+            <w:r>
+              <w:rPr>
+                <w:rFonts w:ascii="Calibri" w:hAnsi="Calibri" w:eastAsia="Calibri" w:cs="Calibri"/>
+                <w:sz w:val="21"/>
+                <w:szCs w:val="21"/>
+              </w:rPr>
+              <w:t>T11</w:t>
+            </w:r>
+          </w:p>
+        </w:tc>
+        <w:tc>
+          <w:tcPr>
+            <w:tcW w:w="2200" w:type="dxa"/>
+            <w:tcBorders>
+              <w:top w:val="single" w:color="FFFFFF" w:sz="4" w:space="0"/>
+              <w:left w:val="single" w:color="FFFFFF" w:sz="4" w:space="0"/>
+              <w:bottom w:val="single" w:color="FFFFFF" w:sz="4" w:space="0"/>
+              <w:right w:val="single" w:color="FFFFFF" w:sz="4" w:space="0"/>
+            </w:tcBorders>
+            <w:shd w:val="clear" w:color="auto" w:fill="CFE2F5"/>
+            <w:tcMar>
+              <w:top w:w="50" w:type="dxa"/>
+              <w:left w:w="80" w:type="dxa"/>
+              <w:bottom w:w="50" w:type="dxa"/>
+              <w:right w:w="80" w:type="dxa"/>
+            </w:tcMar>
+          </w:tcPr>
+          <w:p>
+            <w:pPr>
+              <w:jc w:val="center"/>
+            </w:pPr>
+            <w:r>
+              <w:rPr>
+                <w:rFonts w:ascii="Calibri" w:hAnsi="Calibri" w:eastAsia="Calibri" w:cs="Calibri"/>
+                <w:sz w:val="21"/>
+                <w:szCs w:val="21"/>
+              </w:rPr>
+              <w:t>7</w:t>
+            </w:r>
+          </w:p>
+        </w:tc>
+        <w:tc>
+          <w:tcPr>
+            <w:tcW w:w="3000" w:type="dxa"/>
+            <w:tcBorders>
+              <w:top w:val="single" w:color="FFFFFF" w:sz="4" w:space="0"/>
+              <w:left w:val="single" w:color="FFFFFF" w:sz="4" w:space="0"/>
+              <w:bottom w:val="single" w:color="FFFFFF" w:sz="4" w:space="0"/>
+              <w:right w:val="single" w:color="FFFFFF" w:sz="4" w:space="0"/>
+            </w:tcBorders>
+            <w:shd w:val="clear" w:color="auto" w:fill="CFE2F5"/>
+            <w:tcMar>
+              <w:top w:w="50" w:type="dxa"/>
+              <w:left w:w="80" w:type="dxa"/>
+              <w:bottom w:w="50" w:type="dxa"/>
+              <w:right w:w="80" w:type="dxa"/>
+            </w:tcMar>
+          </w:tcPr>
+          <w:p>
+            <w:pPr>
+              <w:jc w:val="center"/>
+            </w:pPr>
+            <w:r>
+              <w:rPr>
+                <w:rFonts w:ascii="Calibri" w:hAnsi="Calibri" w:eastAsia="Calibri" w:cs="Calibri"/>
+                <w:sz w:val="21"/>
+                <w:szCs w:val="21"/>
+              </w:rPr>
+              <w:t>T9</w:t>
+            </w:r>
+          </w:p>
+        </w:tc>
+      </w:tr>
+      <w:tr>
+        <w:tblPrEx>
+          <w:tblCellMar>
+            <w:top w:w="0" w:type="dxa"/>
+            <w:left w:w="108" w:type="dxa"/>
+            <w:bottom w:w="0" w:type="dxa"/>
+            <w:right w:w="108" w:type="dxa"/>
+          </w:tblCellMar>
+        </w:tblPrEx>
+        <w:trPr>
+          <w:cantSplit/>
+          <w:jc w:val="center"/>
+        </w:trPr>
+        <w:tc>
+          <w:tcPr>
+            <w:tcW w:w="2000" w:type="dxa"/>
+            <w:tcBorders>
+              <w:top w:val="single" w:color="FFFFFF" w:sz="4" w:space="0"/>
+              <w:left w:val="single" w:color="FFFFFF" w:sz="4" w:space="0"/>
+              <w:bottom w:val="single" w:color="FFFFFF" w:sz="4" w:space="0"/>
+              <w:right w:val="single" w:color="FFFFFF" w:sz="4" w:space="0"/>
+            </w:tcBorders>
+            <w:shd w:val="clear" w:color="auto" w:fill="EAF2FB"/>
+            <w:tcMar>
+              <w:top w:w="50" w:type="dxa"/>
+              <w:left w:w="80" w:type="dxa"/>
+              <w:bottom w:w="50" w:type="dxa"/>
+              <w:right w:w="80" w:type="dxa"/>
+            </w:tcMar>
+          </w:tcPr>
+          <w:p>
+            <w:pPr>
+              <w:jc w:val="center"/>
+            </w:pPr>
+            <w:r>
+              <w:rPr>
+                <w:rFonts w:ascii="Calibri" w:hAnsi="Calibri" w:eastAsia="Calibri" w:cs="Calibri"/>
+                <w:sz w:val="21"/>
+                <w:szCs w:val="21"/>
+              </w:rPr>
+              <w:t>T12</w:t>
+            </w:r>
+          </w:p>
+        </w:tc>
+        <w:tc>
+          <w:tcPr>
+            <w:tcW w:w="2200" w:type="dxa"/>
+            <w:tcBorders>
+              <w:top w:val="single" w:color="FFFFFF" w:sz="4" w:space="0"/>
+              <w:left w:val="single" w:color="FFFFFF" w:sz="4" w:space="0"/>
+              <w:bottom w:val="single" w:color="FFFFFF" w:sz="4" w:space="0"/>
+              <w:right w:val="single" w:color="FFFFFF" w:sz="4" w:space="0"/>
+            </w:tcBorders>
+            <w:shd w:val="clear" w:color="auto" w:fill="EAF2FB"/>
+            <w:tcMar>
+              <w:top w:w="50" w:type="dxa"/>
+              <w:left w:w="80" w:type="dxa"/>
+              <w:bottom w:w="50" w:type="dxa"/>
+              <w:right w:w="80" w:type="dxa"/>
+            </w:tcMar>
+          </w:tcPr>
+          <w:p>
+            <w:pPr>
+              <w:jc w:val="center"/>
+            </w:pPr>
+            <w:r>
+              <w:rPr>
+                <w:rFonts w:ascii="Calibri" w:hAnsi="Calibri" w:eastAsia="Calibri" w:cs="Calibri"/>
+                <w:sz w:val="21"/>
+                <w:szCs w:val="21"/>
+              </w:rPr>
+              <w:t>10</w:t>
+            </w:r>
+          </w:p>
+        </w:tc>
+        <w:tc>
+          <w:tcPr>
+            <w:tcW w:w="3000" w:type="dxa"/>
+            <w:tcBorders>
+              <w:top w:val="single" w:color="FFFFFF" w:sz="4" w:space="0"/>
+              <w:left w:val="single" w:color="FFFFFF" w:sz="4" w:space="0"/>
+              <w:bottom w:val="single" w:color="FFFFFF" w:sz="4" w:space="0"/>
+              <w:right w:val="single" w:color="FFFFFF" w:sz="4" w:space="0"/>
+            </w:tcBorders>
+            <w:shd w:val="clear" w:color="auto" w:fill="EAF2FB"/>
+            <w:tcMar>
+              <w:top w:w="50" w:type="dxa"/>
+              <w:left w:w="80" w:type="dxa"/>
+              <w:bottom w:w="50" w:type="dxa"/>
+              <w:right w:w="80" w:type="dxa"/>
+            </w:tcMar>
+          </w:tcPr>
+          <w:p>
+            <w:pPr>
+              <w:jc w:val="center"/>
+            </w:pPr>
+            <w:r>
+              <w:rPr>
+                <w:rFonts w:ascii="Calibri" w:hAnsi="Calibri" w:eastAsia="Calibri" w:cs="Calibri"/>
+                <w:sz w:val="21"/>
+                <w:szCs w:val="21"/>
+              </w:rPr>
+              <w:t>T11</w:t>
+            </w:r>
+          </w:p>
+        </w:tc>
+      </w:tr>
+    </w:tbl>
+    <w:p>
+      <w:pPr>
+        <w:keepNext/>
+        <w:spacing w:before="200" w:after="100"/>
+        <w:rPr>
+          <w:rFonts w:hint="default"/>
+          <w:lang w:val="en-US"/>
+        </w:rPr>
+      </w:pPr>
+      <w:r>
+        <w:rPr>
+          <w:rFonts w:ascii="Calibri" w:hAnsi="Calibri" w:eastAsia="Calibri" w:cs="Calibri"/>
+          <w:b/>
+          <w:bCs/>
+          <w:color w:val="1F4E79"/>
+          <w:sz w:val="26"/>
+          <w:szCs w:val="26"/>
+        </w:rPr>
+        <w:t>Answer: P</w:t>
+      </w:r>
+      <w:r>
+        <w:rPr>
+          <w:rFonts w:hint="default" w:cs="Calibri"/>
+          <w:b/>
+          <w:bCs/>
+          <w:color w:val="1F4E79"/>
+          <w:sz w:val="26"/>
+          <w:szCs w:val="26"/>
+          <w:lang w:val="en-US"/>
+        </w:rPr>
+        <w:t>ert</w:t>
+      </w:r>
+      <w:r>
+        <w:rPr>
+          <w:rFonts w:ascii="Calibri" w:hAnsi="Calibri" w:eastAsia="Calibri" w:cs="Calibri"/>
+          <w:b/>
+          <w:bCs/>
+          <w:color w:val="1F4E79"/>
+          <w:sz w:val="26"/>
+          <w:szCs w:val="26"/>
+        </w:rPr>
+        <w:t xml:space="preserve"> </w:t>
+      </w:r>
+      <w:r>
+        <w:rPr>
+          <w:rFonts w:hint="default" w:cs="Calibri"/>
+          <w:b/>
+          <w:bCs/>
+          <w:color w:val="1F4E79"/>
+          <w:sz w:val="26"/>
+          <w:szCs w:val="26"/>
+          <w:lang w:val="en-US"/>
+        </w:rPr>
+        <w:t>chart</w:t>
+      </w:r>
+    </w:p>
+    <w:p>
+      <w:pPr>
+        <w:spacing w:before="120" w:after="120"/>
+        <w:jc w:val="center"/>
+      </w:pPr>
+      <w:r>
+        <w:drawing>
+          <wp:inline distT="0" distB="0" distL="0" distR="0">
+            <wp:extent cx="5852160" cy="2957830"/>
+            <wp:effectExtent l="0" t="0" r="15240" b="13970"/>
+            <wp:docPr id="903" name="pert_fig3.png" descr="pert_fig3.png"/>
+            <wp:cNvGraphicFramePr>
+              <a:graphicFrameLocks xmlns:a="http://schemas.openxmlformats.org/drawingml/2006/main" noChangeAspect="1"/>
+            </wp:cNvGraphicFramePr>
+            <a:graphic xmlns:a="http://schemas.openxmlformats.org/drawingml/2006/main">
+              <a:graphicData uri="http://schemas.openxmlformats.org/drawingml/2006/picture">
+                <pic:pic xmlns:pic="http://schemas.openxmlformats.org/drawingml/2006/picture">
+                  <pic:nvPicPr>
+                    <pic:cNvPr id="903" name="pert_fig3.png" descr="pert_fig3.png"/>
+                    <pic:cNvPicPr>
+                      <a:picLocks noChangeAspect="1"/>
+                    </pic:cNvPicPr>
+                  </pic:nvPicPr>
+                  <pic:blipFill>
+                    <a:blip r:embed="rId8"/>
+                    <a:stretch>
+                      <a:fillRect/>
+                    </a:stretch>
+                  </pic:blipFill>
+                  <pic:spPr>
+                    <a:xfrm>
+                      <a:off x="0" y="0"/>
+                      <a:ext cx="5852160" cy="2957842"/>
+                    </a:xfrm>
+                    <a:prstGeom prst="rect">
+                      <a:avLst/>
+                    </a:prstGeom>
+                  </pic:spPr>
+                </pic:pic>
+              </a:graphicData>
+            </a:graphic>
+          </wp:inline>
+        </w:drawing>
+      </w:r>
+    </w:p>
+    <w:p>
+      <w:pPr>
+        <w:keepNext/>
+        <w:spacing w:before="200" w:after="100"/>
+      </w:pPr>
+      <w:r>
+        <w:rPr>
+          <w:rFonts w:ascii="Calibri" w:hAnsi="Calibri" w:eastAsia="Calibri" w:cs="Calibri"/>
+          <w:b/>
+          <w:bCs/>
+          <w:color w:val="1F4E79"/>
+          <w:sz w:val="26"/>
+          <w:szCs w:val="26"/>
+        </w:rPr>
+        <w:t>Minimum project duration &amp; critical path</w:t>
+      </w:r>
+    </w:p>
+    <w:p>
+      <w:pPr>
+        <w:spacing w:after="100"/>
+      </w:pPr>
+      <w:r>
+        <w:rPr>
+          <w:rFonts w:ascii="Calibri" w:hAnsi="Calibri" w:eastAsia="Calibri" w:cs="Calibri"/>
+          <w:b/>
+          <w:bCs/>
+          <w:sz w:val="24"/>
+          <w:szCs w:val="24"/>
+        </w:rPr>
+        <w:t xml:space="preserve">Minimum project duration = </w:t>
+      </w:r>
+      <w:r>
+        <w:rPr>
+          <w:rFonts w:ascii="Calibri" w:hAnsi="Calibri" w:eastAsia="Calibri" w:cs="Calibri"/>
+          <w:b/>
+          <w:bCs/>
+          <w:color w:val="B00000"/>
+          <w:sz w:val="24"/>
+          <w:szCs w:val="24"/>
+        </w:rPr>
+        <w:t>55 days</w:t>
+      </w:r>
+    </w:p>
+    <w:p>
+      <w:pPr>
+        <w:spacing w:after="100"/>
+      </w:pPr>
+      <w:r>
+        <w:rPr>
+          <w:rFonts w:ascii="Calibri" w:hAnsi="Calibri" w:eastAsia="Calibri" w:cs="Calibri"/>
+          <w:b/>
+          <w:bCs/>
+          <w:sz w:val="24"/>
+          <w:szCs w:val="24"/>
+        </w:rPr>
+        <w:t xml:space="preserve">Critical path: </w:t>
+      </w:r>
+      <w:r>
+        <w:rPr>
+          <w:rFonts w:ascii="Calibri" w:hAnsi="Calibri" w:eastAsia="Calibri" w:cs="Calibri"/>
+          <w:b/>
+          <w:bCs/>
+          <w:color w:val="B00000"/>
+          <w:sz w:val="24"/>
+          <w:szCs w:val="24"/>
+        </w:rPr>
+        <w:t>T1 → T3 → T9 → T11 → T12</w:t>
+      </w:r>
+    </w:p>
+    <w:p>
+      <w:pPr>
+        <w:spacing w:after="120"/>
+      </w:pPr>
+      <w:r>
+        <w:rPr>
+          <w:rFonts w:ascii="Calibri" w:hAnsi="Calibri" w:eastAsia="Calibri" w:cs="Calibri"/>
+          <w:sz w:val="22"/>
+          <w:szCs w:val="22"/>
+        </w:rPr>
+        <w:t>8 + 15 + 15 + 7 + 10 = 55 days. These activities have zero float (ES = LS), so any delay in one of them delays the whole project. The other activities have float (T2 = 3, T4 = 20, T5 = 15, T6 = 3, T7 = 12, T8 = 20, T10 = 12 days) and can be delayed by that amount without affecting the finish date.</w:t>
+      </w:r>
+    </w:p>
+    <w:p>
+      <w:pPr>
+        <w:keepNext/>
+        <w:spacing w:before="200" w:after="100"/>
+      </w:pPr>
+      <w:r>
+        <w:rPr>
+          <w:rFonts w:ascii="Calibri" w:hAnsi="Calibri" w:eastAsia="Calibri" w:cs="Calibri"/>
+          <w:b/>
+          <w:bCs/>
+          <w:color w:val="1F4E79"/>
+          <w:sz w:val="26"/>
+          <w:szCs w:val="26"/>
+        </w:rPr>
+        <w:t>Answer: Gantt chart</w:t>
+      </w:r>
+    </w:p>
+    <w:p>
+      <w:pPr>
+        <w:spacing w:before="120" w:after="120"/>
+        <w:jc w:val="center"/>
+      </w:pPr>
+      <w:r>
+        <w:drawing>
+          <wp:inline distT="0" distB="0" distL="0" distR="0">
+            <wp:extent cx="5852160" cy="5474970"/>
+            <wp:effectExtent l="0" t="0" r="15240" b="11430"/>
+            <wp:docPr id="904" name="pert_fig4.png" descr="pert_fig4.png"/>
+            <wp:cNvGraphicFramePr>
+              <a:graphicFrameLocks xmlns:a="http://schemas.openxmlformats.org/drawingml/2006/main" noChangeAspect="1"/>
+            </wp:cNvGraphicFramePr>
+            <a:graphic xmlns:a="http://schemas.openxmlformats.org/drawingml/2006/main">
+              <a:graphicData uri="http://schemas.openxmlformats.org/drawingml/2006/picture">
+                <pic:pic xmlns:pic="http://schemas.openxmlformats.org/drawingml/2006/picture">
+                  <pic:nvPicPr>
+                    <pic:cNvPr id="904" name="pert_fig4.png" descr="pert_fig4.png"/>
+                    <pic:cNvPicPr>
+                      <a:picLocks noChangeAspect="1"/>
+                    </pic:cNvPicPr>
+                  </pic:nvPicPr>
+                  <pic:blipFill>
+                    <a:blip r:embed="rId9"/>
+                    <a:stretch>
+                      <a:fillRect/>
+                    </a:stretch>
+                  </pic:blipFill>
+                  <pic:spPr>
+                    <a:xfrm>
+                      <a:off x="0" y="0"/>
+                      <a:ext cx="5852160" cy="5474985"/>
+                    </a:xfrm>
+                    <a:prstGeom prst="rect">
+                      <a:avLst/>
+                    </a:prstGeom>
+                  </pic:spPr>
+                </pic:pic>
+              </a:graphicData>
+            </a:graphic>
+          </wp:inline>
+        </w:drawing>
+      </w:r>
+    </w:p>
     <w:sectPr>
-      <w:footerReference r:id="rId3" w:type="default"/>
-      <w:pgSz w:w="16838" w:h="11906" w:orient="landscape"/>
-      <w:pgMar w:top="760" w:right="1034" w:bottom="760" w:left="1034" w:header="708" w:footer="708" w:gutter="0"/>
+      <w:pgSz w:w="11906" w:h="16838"/>
+      <w:pgMar w:top="1134" w:right="1134" w:bottom="1134" w:left="1134" w:header="708" w:footer="708" w:gutter="0"/>
       <w:cols w:space="720" w:num="1"/>
       <w:docGrid w:linePitch="360" w:charSpace="0"/>
     </w:sectPr>
@@ -6437,10 +10109,10 @@
     <w:lsdException w:unhideWhenUsed="0" w:uiPriority="0" w:semiHidden="0" w:name="toc 8"/>
     <w:lsdException w:unhideWhenUsed="0" w:uiPriority="0" w:semiHidden="0" w:name="toc 9"/>
     <w:lsdException w:unhideWhenUsed="0" w:uiPriority="0" w:semiHidden="0" w:name="Normal Indent"/>
-    <w:lsdException w:uiPriority="99" w:name="footnote text"/>
+    <w:lsdException w:qFormat="1" w:uiPriority="99" w:name="footnote text"/>
     <w:lsdException w:unhideWhenUsed="0" w:uiPriority="0" w:semiHidden="0" w:name="annotation text"/>
-    <w:lsdException w:unhideWhenUsed="0" w:uiPriority="0" w:semiHidden="0" w:name="header"/>
-    <w:lsdException w:unhideWhenUsed="0" w:uiPriority="0" w:semiHidden="0" w:name="footer"/>
+    <w:lsdException w:qFormat="1" w:unhideWhenUsed="0" w:uiPriority="0" w:semiHidden="0" w:name="header"/>
+    <w:lsdException w:qFormat="1" w:unhideWhenUsed="0" w:uiPriority="0" w:semiHidden="0" w:name="footer"/>
     <w:lsdException w:unhideWhenUsed="0" w:uiPriority="0" w:semiHidden="0" w:name="index heading"/>
     <w:lsdException w:qFormat="1" w:uiPriority="0" w:name="caption"/>
     <w:lsdException w:unhideWhenUsed="0" w:uiPriority="0" w:semiHidden="0" w:name="table of figures"/>
@@ -6806,6 +10478,7 @@
   <w:style w:type="paragraph" w:styleId="12">
     <w:name w:val="footer"/>
     <w:basedOn w:val="1"/>
+    <w:qFormat/>
     <w:uiPriority w:val="0"/>
     <w:pPr>
       <w:tabs>
@@ -6835,6 +10508,7 @@
     <w:link w:val="19"/>
     <w:semiHidden/>
     <w:unhideWhenUsed/>
+    <w:qFormat/>
     <w:uiPriority w:val="99"/>
     <w:pPr>
       <w:spacing w:after="0" w:line="240" w:lineRule="auto"/>
@@ -6848,6 +10522,7 @@
   <w:style w:type="paragraph" w:styleId="15">
     <w:name w:val="header"/>
     <w:basedOn w:val="1"/>
+    <w:qFormat/>
     <w:uiPriority w:val="0"/>
     <w:pPr>
       <w:tabs>
@@ -6896,6 +10571,7 @@
     <w:link w:val="14"/>
     <w:semiHidden/>
     <w:unhideWhenUsed/>
+    <w:qFormat/>
     <w:uiPriority w:val="99"/>
     <w:rPr>
       <w:sz w:val="20"/>

</xml_diff>